<commit_message>
Rebuild exports after the referee batch
Listen edition 59,569 words (md/docx/pdf), print PDF + EPUB re-rendered.
Note: the ⁂ asterism glyph is missing from the listen PDF's latin-modern
font — renders in print PDF and EPUB.

Co-Authored-By: Claude Fable 5 <noreply@anthropic.com>
</commit_message>
<xml_diff>
--- a/exports/society-in-silico-listen.docx
+++ b/exports/society-in-silico-listen.docx
@@ -46,7 +46,7 @@
         <w:pStyle w:val="FirstParagraph"/>
       </w:pPr>
       <w:r>
-        <w:t xml:space="preserve">In 2019 I wanted a number nobody would give me. The question was simple to state: if the United States paid every adult a basic income, how many families would that pull over the poverty line, and what would it cost once you netted out the programs it replaced? Congress had models that could answer it. So did the Treasury, the Congressional Budget Office, the Tax Policy Center, the Joint Committee on Taxation. I could read their reports. I could not ask their models my question, because the models lived behind institutional walls, ran on confidential data, and answered only to their owners.</w:t>
+        <w:t xml:space="preserve">In 2019 I wanted a number nobody would give me. The question was simple to state: if the United States paid every adult a basic income, how many families would that pull over the poverty line, and what would it cost once you netted out the programs it replaced? Congress had models that could answer it — the Congressional Budget Office’s, the Joint Committee on Taxation’s. So did the Treasury, and, outside government, the Tax Policy Center. I could read their reports. I could not ask their models my question, because the models lived behind institutional walls, most ran on confidential data, and all answered only to their owners.</w:t>
       </w:r>
     </w:p>
     <w:p>
@@ -269,7 +269,7 @@
         <w:pStyle w:val="BodyText"/>
       </w:pPr>
       <w:r>
-        <w:t xml:space="preserve">They had also, without meaning to, posed a design question that this book spends nineteen chapters answering. The dangerous thing about Rehoboam was never the simulation. It was the secrecy, the monopoly, and the absence of anything that could tell the system it was wrong. Governments already score citizens for fraud risk and bail decisions with models no defendant can inspect. Insurers price your premiums with algorithms they will not explain. The machinery of prediction exists and is spreading; the only live question is its architecture. Closed, proprietary, graded by no one? Or open, inspectable, and checked — line by line — against the world it claims to describe?</w:t>
+        <w:t xml:space="preserve">They had also, without meaning to, posed a design question that this book spends seventeen chapters answering. The dangerous thing about Rehoboam was never the simulation. It was the secrecy, the monopoly, and the absence of anything that could tell the system it was wrong. Governments already score citizens for fraud risk and bail decisions with models no defendant can inspect. Insurers price your premiums with algorithms they will not explain. The machinery of prediction exists and is spreading; the only live question is its architecture. Closed, proprietary, graded by no one? Or open, inspectable, and checked — line by line — against the world it claims to describe?</w:t>
       </w:r>
     </w:p>
     <w:p>
@@ -310,7 +310,7 @@
         <w:pStyle w:val="BodyText"/>
       </w:pPr>
       <w:r>
-        <w:t xml:space="preserve">Researchers had seen it coming. In 2023, a Johns Hopkins and Maryland team found GPT-4 answered only 67 percent of true-or-false tax questions correctly — better than a coin, useless for a filing. And it has not aged away. By mid-2026, PolicyEngine’s own benchmark, PolicyBench, was scoring twenty frontier and open models on complete household tax-and-benefit calculations; the best model still got roughly one in six households wrong by more than a dollar, and most missed a quarter or more. These are not rounding slips. A miss means the model told a family the wrong Medicaid eligibility or the wrong food-assistance amount.</w:t>
+        <w:t xml:space="preserve">Researchers had seen it coming. In 2023, a Johns Hopkins and Maryland team found GPT-4 answered only 67 percent of true-or-false tax questions correctly — better than a coin, useless for a filing. And it has not aged away. By mid-2026, PolicyEngine’s own benchmark, PolicyBench, was scoring two dozen frontier and open models on complete household tax-and-benefit calculations; the best model still got roughly one in nine households wrong by more than a dollar, and the typical model missed about one in four. These are not rounding slips. A miss means the model told a family the wrong Medicaid eligibility or the wrong food-assistance amount.</w:t>
       </w:r>
     </w:p>
     <w:p>
@@ -560,7 +560,7 @@
         <w:t xml:space="preserve"> </w:t>
       </w:r>
       <w:r>
-        <w:t xml:space="preserve">Orcutt’s idea; the institutional models that ran the country’s fiscal arguments from behind closed doors; and the question that disciplines everything: how would you know whether any model is right?</w:t>
+        <w:t xml:space="preserve">Orcutt’s idea; the institutional models that ran the country’s fiscal arguments from behind closed doors; the question that disciplines everything — how would you know whether any model is right? — and the family arithmetic that turned the question personal.</w:t>
       </w:r>
     </w:p>
     <w:p>
@@ -1323,7 +1323,7 @@
         <w:pStyle w:val="BodyText"/>
       </w:pPr>
       <w:r>
-        <w:t xml:space="preserve">The institution behind the model began, like a surprising number of things in this book, with frustration at a tax law nobody could decode. The 1965 Finance Act had introduced capital gains tax to Britain in a form so opaque that four financial professionals — the banker Will Hopper, the investment-trust manager Bob Buist, the stockbroker Nils Taube, and the tax consultant John Chown — decided the country needed an institution whose job was understanding fiscal policy from outside the government. They settled it over dinner on July 30, 1968, at the Stella Alpina restaurant in London, and incorporated the Institute for Fiscal Studies the following year. Fourteen years from a dinner-table grievance to a model that could check the Treasury’s arithmetic: that is roughly the speed at which this kind of independence gets built, and it is worth remembering later, when the building speeds up.</w:t>
+        <w:t xml:space="preserve">The institution behind the model began, like a surprising number of things in this book, with frustration at a tax law nobody could decode. The 1965 Finance Act had introduced capital gains tax to Britain in a form so opaque that four financial professionals — the banker Will Hopper, the investment-trust manager Bob Buist, the stockbroker Nils Taube, and the tax consultant John Chown — decided the country needed an institution whose job was understanding fiscal policy from outside the government. They settled it over dinner on July 30, 1968, at the Stella Alpina restaurant in London, and incorporated the Institute for Fiscal Studies the following year. Fifteen years from a dinner-table grievance to a model that could check the Treasury’s arithmetic: that is roughly the speed at which this kind of independence gets built, and it is worth remembering later, when the building speeds up.</w:t>
       </w:r>
     </w:p>
     <w:p>
@@ -1401,7 +1401,7 @@
         <w:pStyle w:val="BodyText"/>
       </w:pPr>
       <w:r>
-        <w:t xml:space="preserve">And because taxes were only half the ledger, the Urban Institute — Orcutt’s old home — ran TRIM3, updated every year from the Current Population Survey to model the programs the tax models left out: SNAP, Medicaid, TANF, SSI, housing assistance. TRIM3 captured the interaction between taxes and transfers, the thing TAXBEN had shown mattered. It served government agencies under contract, not the public.</w:t>
+        <w:t xml:space="preserve">And because taxes were only half the ledger, the Urban Institute — Orcutt’s old home — ran the TRIM series, updated every year from the Current Population Survey to model the programs the tax models left out: SNAP, Medicaid, TANF, SSI, housing assistance. It captured the interaction between taxes and transfers, the thing TAXBEN had shown mattered. It served government agencies under contract, not the public.</w:t>
       </w:r>
     </w:p>
     <w:p>
@@ -1645,7 +1645,7 @@
         <w:pStyle w:val="BodyText"/>
       </w:pPr>
       <w:r>
-        <w:t xml:space="preserve">And individuals got leverage. Howard Reed ran TAXBEN inside the IFS from 2000 to 2004, spent a spell as chief economist at IPPR, then founded Landman Economics in 2008 and built his own tax-transfer model, which he pointed at basic income, welfare reform, and the cumulative toll of austerity — work in service of an ambition he described as</w:t>
+        <w:t xml:space="preserve">And individuals could do it alone. Howard Reed ran TAXBEN inside the IFS from 2000 to 2004, spent a spell as chief economist at IPPR, then founded Landman Economics in 2008 and built his own tax-transfer model, which he pointed at basic income, welfare reform, and the cumulative toll of austerity — work in service of an ambition he described as</w:t>
       </w:r>
       <w:r>
         <w:t xml:space="preserve"> </w:t>
@@ -2205,7 +2205,19 @@
         <w:pStyle w:val="FirstParagraph"/>
       </w:pPr>
       <w:r>
-        <w:t xml:space="preserve">If forecasting is the weak flank, it is worth asking who does it well. One answer that actually gets graded: markets where people bet. An NBER study of prediction markets found their forecasts at least as accurate as — and generally somewhat better than — survey forecasts across GDP, inflation, and employment. The Monday before the 2024 presidential vote, with polls showing a coin flip, Polymarket had Donald Trump at 58 percent. Academic comparisons of market prices against FiveThirtyEight’s model found the markets competitive or better. For Federal Reserve decisions, Good Judgment’s superforecasters reportedly beat financial futures markets by about 30 percent in 2024–2025. Behind that last result sits Philip Tetlock’s two decades of evidence: most experts forecast little better than chance, but a small minority — roughly 2 percent of Good Judgment Project participants — consistently outperform, by updating often, thinking in probabilities, and refusing to marry a prediction to an ideology.</w:t>
+        <w:t xml:space="preserve">If forecasting is the weak flank, it is worth asking who does it well. One answer that actually gets graded: markets where people bet. An NBER study of prediction markets found their forecasts</w:t>
+      </w:r>
+      <w:r>
+        <w:t xml:space="preserve"> </w:t>
+      </w:r>
+      <w:r>
+        <w:t xml:space="preserve">“weakly more accurate”</w:t>
+      </w:r>
+      <w:r>
+        <w:t xml:space="preserve"> </w:t>
+      </w:r>
+      <w:r>
+        <w:t xml:space="preserve">than survey forecasts — the study’s own careful phrase — across GDP, inflation, and employment. The Monday before the 2024 presidential vote, with polls showing a coin flip, Polymarket had Donald Trump at 58 percent. Academic comparisons of market prices against FiveThirtyEight’s model found the markets competitive or better. For Federal Reserve decisions, Good Judgment’s superforecasters reportedly beat financial futures markets by about 30 percent in 2024–2025. Behind that last result sits Philip Tetlock’s two decades of evidence: most experts forecast little better than chance, but a small minority — roughly 2 percent of Good Judgment Project participants — consistently outperform, by updating often, thinking in probabilities, and refusing to marry a prediction to an ideology.</w:t>
       </w:r>
     </w:p>
     <w:p>
@@ -2752,7 +2764,7 @@
         <w:t xml:space="preserve"> </w:t>
       </w:r>
       <w:r>
-        <w:t xml:space="preserve">— No 10’s data-science team — for roughly six months from the summer of 2025, building microsimulation tooling on PolicyEngine. I note it here as a disclosure — much of what follows in this book touches UK policy and the institutions that model it — and because the shape of the thing is hard to improve on: the co-founder I recruited from a subreddit now works inside the government whose analytical machinery these tools were built to open up.)</w:t>
+        <w:t xml:space="preserve">— No 10’s data-science team — for roughly six months from the summer of 2025, building microsimulation tooling on PolicyEngine. I note it here as a disclosure — much of what follows in this book touches UK policy and the institutions that model it.)</w:t>
       </w:r>
     </w:p>
     <w:p>
@@ -2871,7 +2883,7 @@
         <w:pStyle w:val="BodyText"/>
       </w:pPr>
       <w:r>
-        <w:t xml:space="preserve">Almost none of it was usable by anyone who could not write code. I knew, because I had spent the boom running the UBI Center — the open-source research shop I started in 2019 when no public tool could say with any specificity what a basic income would cost or whom it would help — on exactly these tools: Tax-Calculator, custom Python, Census survey data. Two lessons kept arriving. The first was fragmentation. Tax-Calculator handled federal income tax but ignored benefits; TAXSIM handled state taxes but ran in batches; nothing captured the full tax-benefit interaction that decides whether a basic income is progressive, regressive, or poverty-reducing. Fund a basic income by tapering an existing benefit and you can lift some families while stranding others at a cliff — and no available tool showed both effects at once. The second lesson was the access gap. The audience for policy analysis was far larger than the audience that could run the tools. Our analyses lived in Jupyter notebooks, which meant a reader could not change a parameter, swap in their own household, or model their own group’s variant. The code was public. The ability to use it was not.</w:t>
+        <w:t xml:space="preserve">Almost none of it was usable by anyone who could not write code. I knew, because I had spent the boom running the UBI Center — the open-source research shop I started in 2019 when no public tool could say with any specificity what a basic income would cost or whom it would help — on exactly these tools: Tax-Calculator, custom Python, Census survey data. Two lessons kept arriving. The first was fragmentation. Tax-Calculator handled federal income tax but ignored benefits; TAXSIM handled state taxes but ran in batches; nothing captured the full tax-benefit interaction that decides whether a basic income is progressive, regressive, or poverty-reducing. Fund a basic income by tapering an existing benefit and you can lift some families while stranding others at a cliff — and no available tool showed both effects at once. The second lesson was the access gap. The audience for policy analysis was far larger than the audience that could run the tools. Our analyses lived in Jupyter notebooks, which meant a reader could not change a parameter, swap in their own household, or model their own group’s variant. The code was public; the ability to use it was not — the wall chapter 4 ended on, met again from inside the notebook.</w:t>
       </w:r>
     </w:p>
     <w:bookmarkStart w:id="55" w:name="putting-the-model-in-a-browser"/>
@@ -4657,15 +4669,15 @@
         <w:pStyle w:val="BodyText"/>
       </w:pPr>
       <w:r>
-        <w:t xml:space="preserve">By 2026 we had built the harder version ourselves. A federal return is one slice of a household’s situation; most families meet taxes and benefits at once, an EITC phasing out while SNAP phases down while Medicaid eligibility flips near a threshold. PolicyBench, our public benchmark, draws realistic household scenarios from calibrated microdata — so the cases cluster where actual households are complicated, with multiple earners, mixed-age children, stacked benefits — and asks around twenty frontier and open-weight models for the complete tax-and-benefit result, scored against the engine’s answer to within a dollar. As of mid-2026, the best model still got roughly one in six household calculations wrong by more than that dollar, and most models missed a quarter or more. The dollar threshold earns its keep: the misses are not rounding. They are a household ruled ineligible for Medicaid that qualifies, a food-assistance amount off by real money, a credit at the wrong value. A benefit determination is a number that decides whether a family gets help this month.</w:t>
-      </w:r>
-    </w:p>
-    <w:p>
-      <w:pPr>
-        <w:pStyle w:val="BodyText"/>
-      </w:pPr>
-      <w:r>
-        <w:t xml:space="preserve">Three benchmarks, three years, one verdict. The obvious rejoinder at every step was that the next model generation would grow out of it, and the dates are the answer: several generations of frontier models came and went between the first test and the last, and the failure survived them all, migrating from reading comprehension to table lookups to program interactions as the tests grew more realistic. Each benchmark measured the same collision from a different angle — a machine trained on the patterns in text meeting a body of rules that is not a pattern. The rules change every January. They differ across fifty states. They turn on interactions among dozens of provisions, and next year’s thresholds appear in no training set, because Congress has not written them yet. The next chapter takes up why this is permanent; what mattered in 2023 was the practical inference. If frontier models cannot reliably compute a return, they need a tool, not a bigger corpus. AI systems do not memorize multiplication tables; they call calculators. An AI answering a tax question should call a tax engine.</w:t>
+        <w:t xml:space="preserve">By 2026 we had built the harder version ourselves. A federal return is one slice of a household’s situation; most families meet taxes and benefits at once, an EITC phasing out while SNAP phases down while Medicaid eligibility flips near a threshold. PolicyBench, our public benchmark, draws realistic household scenarios from calibrated microdata — so the cases cluster where actual households are complicated, with multiple earners, mixed-age children, stacked benefits — and asks two dozen frontier and open-weight models for the complete tax-and-benefit result, scored against the engine’s answer to within a dollar. As of mid-2026, the best model still got roughly one in nine household calculations wrong by more than that dollar, and the typical model missed about one in four. The dollar threshold earns its keep: the misses are not rounding. They are a household ruled ineligible for Medicaid that qualifies, a food-assistance amount off by real money, a credit at the wrong value. A benefit determination is a number that decides whether a family gets help this month.</w:t>
+      </w:r>
+    </w:p>
+    <w:p>
+      <w:pPr>
+        <w:pStyle w:val="BodyText"/>
+      </w:pPr>
+      <w:r>
+        <w:t xml:space="preserve">Three benchmarks, three years, one verdict. The obvious rejoinder at every step was that the next model generation would grow out of it, and the dates are the answer: several generations of frontier models came and went between the first test and the last, and the failure survived them all, migrating from reading comprehension to table lookups to program interactions as the tests grew more realistic. Each benchmark measured the same collision from a different angle — a machine trained on the patterns in text meeting a body of rules that is not a pattern. The rules change every January. They differ across fifty states. They turn on interactions among dozens of provisions, and next year’s thresholds appear in no training set, because no one has written them yet. The next chapter takes up why this is permanent; what mattered in 2023 was the practical inference. If frontier models cannot reliably compute a return, they need a tool, not a bigger corpus. AI systems do not memorize multiplication tables; they call calculators. An AI answering a tax question should call a tax engine.</w:t>
       </w:r>
     </w:p>
     <w:bookmarkEnd w:id="81"/>
@@ -4947,7 +4959,7 @@
         <w:t xml:space="preserve">on their own because tax calculations require 100% correctness”</w:t>
       </w:r>
       <w:r>
-        <w:t xml:space="preserve">. On our benchmark, the best 2026 models still got roughly one in six household calculations wrong by more than a dollar. The answer was never a better prompt. The answer is a deterministic, auditable engine the model calls — the tool chapter 8 specified and this chapter builds.</w:t>
+        <w:t xml:space="preserve">. On our benchmark, the best 2026 models still got roughly one in nine household calculations wrong by more than a dollar. The answer was never a better prompt. The answer is a deterministic, auditable engine the model calls — the tool chapter 8 specified and this chapter builds.</w:t>
       </w:r>
     </w:p>
     <w:bookmarkEnd w:id="87"/>
@@ -5011,7 +5023,7 @@
         <w:pStyle w:val="FirstParagraph"/>
       </w:pPr>
       <w:r>
-        <w:t xml:space="preserve">Then policy started billing for it. The One Big Beautiful Bill Act — Public Law 119-21, enacted July 4, 2025 — did something no federal benefits law had done: it pegged a state’s budget to the accuracy of its own administration. Beginning in fiscal 2028, states pay a share of SNAP benefit costs tied to their own payment error rate: nothing while the rate stays under 6 percent, then 5, 10, or 15 percent of benefits as it crosses 6, 8, and 10 percent — and for that first year, a state may elect whether its fiscal 2025 or 2026 error rate is the one that counts. The national payment error rate for fiscal 2025 was 10.62 percent, an average that would put many states straight into the top tier; one outside estimate put first-year state exposure at roughly $9 billion. The same law raises the state share of SNAP administrative costs from 50 to 75 percent in fiscal 2027. Medicaid’s new work requirements, meanwhile, oblige expansion states to stand up systems by the end of 2026 to verify that able-bodied adults are meeting an eighty-hour-a-month engagement requirement. A payment error rate used to be an audit statistic. It is now a line in the state budget — and lowering it is precisely the job of rules infrastructure that is verified, current, and provenance-carrying.</w:t>
+        <w:t xml:space="preserve">Then policy started billing for it. The One Big Beautiful Bill Act — Public Law 119-21, enacted July 4, 2025 — sharpened a decades-old lever: quality-control penalties for high error rates go back decades, but for the first time states pay a share of the benefit costs themselves. Beginning in fiscal 2028, that share is tied to the state’s own payment error rate: nothing while the rate stays under 6 percent, then 5, 10, or 15 percent of benefits as it crosses 6, 8, and 10 percent — and for that first year, a state may elect whether its fiscal 2025 or 2026 error rate is the one that counts. The national payment error rate for fiscal 2025 was 10.62 percent, an average that would put many states straight into the top tier; one outside estimate put first-year state exposure at roughly $9 billion. The same law raises the state share of SNAP administrative costs from 50 to 75 percent in fiscal 2027. Medicaid’s new work requirements, meanwhile, oblige expansion states to stand up systems by the end of 2026 to verify that able-bodied adults are meeting an eighty-hour-a-month engagement requirement. A payment error rate used to be an audit statistic. It is now a line in the state budget — and lowering it is precisely the job of rules infrastructure that is verified, current, and provenance-carrying.</w:t>
       </w:r>
     </w:p>
     <w:p>
@@ -5192,7 +5204,7 @@
         <w:pStyle w:val="FirstParagraph"/>
       </w:pPr>
       <w:r>
-        <w:t xml:space="preserve">By July 2026 the US repository held on the order of 3,000 rule files with matching tests, covering federal law plus twenty-eight state codes — absorbed with their full git history, so the encodings inherit years of prior fixes and the reasoning behind them, a change of representation rather than a fresh start with fresh bugs. Separate monorepos carried the United Kingdom, Canada, New Zealand, and Belgium, alongside a set of African lanes validated against established reference models — the next two chapters take those up in full. A single pipeline produced all of it, which puts the marginal cost of the next jurisdiction in units of agent-time rather than institution-years.</w:t>
+        <w:t xml:space="preserve">By July 2026 the US repository held on the order of 3,000 rule files with matching tests, covering federal law plus twenty-eight state codes — absorbed with their full git history, so the encodings inherit years of prior fixes and the reasoning behind them, a change of representation rather than a fresh start with fresh bugs. Separate monorepos carried the United Kingdom, Canada, New Zealand, and Belgium, alongside a set of African lanes validated against established reference models — the next two chapters take up the reference-model races and the African week. A single pipeline produced all of it, which puts the marginal cost of the next jurisdiction in units of agent-time rather than institution-years.</w:t>
       </w:r>
     </w:p>
     <w:p>
@@ -5995,7 +6007,7 @@
         <w:pStyle w:val="BodyText"/>
       </w:pPr>
       <w:r>
-        <w:t xml:space="preserve">What the July week changed is the marginal cost of ending that silence. An independent, verified encoding of a country’s tax-benefit law went from a multi-year undertaking to a job of days — with fourteen SOUTHMOD-family reference models standing ready to check the work, a decade of UNU-WIDER’s institution-building converted into the very ground truth that makes fast encoding trustworthy. The SOUTHMOD models themselves are free for non-commercial research; the encodings ship under Apache and Creative Commons licenses that permit any use, with the findings ledgers public beside them. Openness runs in both directions here or it is not openness: the countries get an independent open implementation, and the reference models get evidence-backed quality assurance from the most exhaustive reader they have ever had.</w:t>
+        <w:t xml:space="preserve">What the July week changed is the marginal cost of ending that silence. An independent, verified encoding of a country’s tax-benefit law went from a multi-year undertaking to a job of days — with fourteen SOUTHMOD-family reference models standing ready to check the work, a decade of UNU-WIDER’s institution-building converted into the very ground truth that makes fast encoding trustworthy. The encodings ship under Apache and Creative Commons licenses, with the findings ledgers public beside them. Openness runs in both directions here or it is not openness: the countries get an independent open implementation, and the reference models get evidence-backed quality assurance from the most exhaustive reader they have ever had.</w:t>
       </w:r>
     </w:p>
     <w:bookmarkEnd w:id="107"/>
@@ -6217,7 +6229,7 @@
         <w:pStyle w:val="BodyText"/>
       </w:pPr>
       <w:r>
-        <w:t xml:space="preserve">The Axiom Foundation, chapter 9’s subject, is the determinism pole. It encodes law exactly — federal statutes, state codes, agency manuals, the council-tax scheme of a single London borough — and asks its agents to state, never to guess. Its public launch is set for July 28, 2026. Everything it ships is meant to be right the way a proof is right: checkable line by line against a source, and wrong only if the source is.</w:t>
+        <w:t xml:space="preserve">The Axiom Foundation, chapter 9’s subject, is the determinism pole. It encodes law exactly — federal statutes, state codes, agency manuals, the council-tax-reduction scheme of a single London borough — and asks its agents to state, never to guess. Its public launch is set for July 28, 2026. Everything it ships is meant to be right the way a proof is right: checkable line by line against a source, and wrong only if the source is.</w:t>
       </w:r>
     </w:p>
     <w:p>
@@ -6273,7 +6285,7 @@
         <w:pStyle w:val="BodyText"/>
       </w:pPr>
       <w:r>
-        <w:t xml:space="preserve">The book’s discipline thereby becomes a literal product feature. Every forecast on the docket carries a published interval and will be graded when the official number lands. As of this writing, none has resolved. The scoreboard is live; the grades arrive with reality — and there is nothing else honest to report about a forecasting institution three months before its first resolution.</w:t>
+        <w:t xml:space="preserve">The book’s discipline thereby becomes a literal product feature. Every forecast on the docket carries a published interval and will be graded when the official number lands. As of this writing, none has resolved. The scoreboard is live; the grades arrive with reality — and there is nothing else honest to report about a forecasting institution whose first resolutions are still months away.</w:t>
       </w:r>
     </w:p>
     <w:bookmarkEnd w:id="112"/>
@@ -6391,7 +6403,7 @@
         <w:pStyle w:val="BodyText"/>
       </w:pPr>
       <w:r>
-        <w:t xml:space="preserve">The distinction turns on a single preposition. Operators build on the commons. They never own it. The foundation states the commitment plainly: the commercial service tier will always be a separate entity, so the institution stewarding law-as-code never finds itself competing with the builders who depend on it. A steward that also sells is a steward with a thumb on the scale. One such operator already exists in formation, organized around graded simulation offered as a service; it is not yet public, and nothing about the commons depends on it. The rules and the data would stay open whether or not any company ever billed for a runtime built on them — which is the test of whether a commons is real rather than rhetorical. It must survive its operators, outlast any one of them, and owe none of them anything.</w:t>
+        <w:t xml:space="preserve">The distinction turns on a single preposition. Operators build on the commons. They never own it. The foundation states the commitment plainly: the commercial service tier will always be a separate entity, so the institution stewarding law-as-code never finds itself competing with the builders who depend on it. A steward that also sells is a steward with a thumb on the scale. The operator chapter 9 mentioned is the live case — organized around graded simulation offered as a service, in formation, not yet public — and nothing about the commons depends on it. The rules and the data would stay open whether or not any company ever billed for a runtime built on them — which is the test of whether a commons is real rather than rhetorical. It must survive its operators, outlast any one of them, and owe none of them anything.</w:t>
       </w:r>
     </w:p>
     <w:p>
@@ -6621,7 +6633,7 @@
         <w:pStyle w:val="BodyText"/>
       </w:pPr>
       <w:r>
-        <w:t xml:space="preserve">Every result in this book so far has been a single number. A reform costs £12 billion. A policy cuts poverty 15 percent. A single mother faces a 47 percent marginal rate. That is not a defect of one model; the microsimulation paradigm, from Orcutt forward, was built to answer</w:t>
+        <w:t xml:space="preserve">Every result in this book so far has been a single number. A taper cut costs £2.8 billion. A carbon dividend cuts poverty 10 percent. A single mother faces an 80 percent marginal rate. That is not a defect of one model; the microsimulation paradigm, from Orcutt forward, was built to answer</w:t>
       </w:r>
       <w:r>
         <w:t xml:space="preserve"> </w:t>
@@ -6650,7 +6662,7 @@
         <w:pStyle w:val="FirstParagraph"/>
       </w:pPr>
       <w:r>
-        <w:t xml:space="preserve">Start with where the model’s people come from. The Current Population Survey’s March supplement asks fewer than ninety thousand households to stand in for a country of more than 130 million. For a national aggregate that is plenty; for the cell you actually care about — self-employed workers in Montana with investment income — it may be a handful of records, and the sampling error in each cell propagates when the model sums weighted impacts across the country. Calibration helps: the machinery chapter 7 described cut the Enhanced CPS’s deviations from its administrative calibration targets by roughly 97 percent. But calibration pins down the questions the government already publishes answers to. It does nothing for the variance of a question nobody has posed. Call this input-data uncertainty: the survey is a sample, and every number computed from it inherits the sample’s noise.</w:t>
+        <w:t xml:space="preserve">Start with where the model’s people come from. The Current Population Survey’s March supplement asks fewer than ninety thousand households to stand in for a country of more than 130 million. For a national aggregate that is plenty; for the cell you actually care about — self-employed workers in Montana with investment income — it may be a handful of records, and the sampling error in each cell propagates when the model sums weighted impacts across the country. Calibration helps: the machinery chapters 6 and 7 described cut the Enhanced CPS’s deviations from its administrative calibration targets by roughly 97 percent. But calibration pins down the questions the government already publishes answers to. It does nothing for the variance of a question nobody has posed. Call this input-data uncertainty: the survey is a sample, and every number computed from it inherits the sample’s noise.</w:t>
       </w:r>
     </w:p>
     <w:p>
@@ -7321,15 +7333,7 @@
         <w:pStyle w:val="BodyText"/>
       </w:pPr>
       <w:r>
-        <w:t xml:space="preserve">The first prototype built personas. From microdata it assembled a demographically detailed individual and asked the model to answer as her: you are a 45-year-old registered nurse in rural Ohio earning $62,000 a year, a weekly churchgoer, a 2020 Republican voter — do you support raising the federal minimum wage to $15 an hour? The nurse is invented, here and in the prototype; invention is what a persona is. Ask a thousand such personas, drawn from real demographic distributions, and the output has the shape of a survey: toplines, crosstabs, gradients by income and age. Watching it run feels like reading a poll of a country that answers in minutes.</w:t>
-      </w:r>
-    </w:p>
-    <w:p>
-      <w:pPr>
-        <w:pStyle w:val="BodyText"/>
-      </w:pPr>
-      <w:r>
-        <w:t xml:space="preserve">Benchmarked against known 2024 survey values, persona roleplay landed at roughly 25 points of mean absolute error, on toplines and subgroups alike — enough to put the majority on the wrong side of a 60–40 question.</w:t>
+        <w:t xml:space="preserve">The first prototype built personas. From microdata it assembled a demographically detailed individual and asked the model to answer as her: you are a 45-year-old registered nurse in rural Ohio earning $62,000 a year, a weekly churchgoer, a 2020 Republican voter — do you support raising the federal minimum wage to $15 an hour? The nurse is invented, here and in the prototype; invention is what a persona is. Ask a thousand such personas, drawn from real demographic distributions, and the output has the shape of a survey: toplines, crosstabs, gradients by income and age. Watching it run feels like reading a poll of a country that answers in minutes. Benchmarked against known 2024 survey values, persona roleplay landed at roughly 25 points of mean absolute error, on toplines and subgroups alike — enough to put the majority on the wrong side of a 60–40 question.</w:t>
       </w:r>
     </w:p>
     <w:p>
@@ -7355,7 +7359,7 @@
         <w:pStyle w:val="FirstParagraph"/>
       </w:pPr>
       <w:r>
-        <w:t xml:space="preserve">The version of HiveSight that shipped on July 7, 2026, keeps the microdata and retires the actors. Post-stratification is a workhorse of survey statistics: chop the population into demographic cells, estimate opinion within each cell, and reweight the cells to the population’s known composition. It is the technique that lets a skewed online panel still call an election, and HiveSight keeps the whole apparatus, swapping a language model into the estimation slot. Roughly 150 cells per geography, drawn from populace, the same calibrated microdata the rest of the stack stands on; for each cell the model is asked not to be a person but to estimate a distribution — across people like this, how do the answers spread? — and the cell-level estimates aggregate under calibrated weights.</w:t>
+        <w:t xml:space="preserve">The version of HiveSight that shipped in July 2026 keeps the microdata and retires the actors. Post-stratification is a workhorse of survey statistics: chop the population into demographic cells, estimate opinion within each cell, and reweight the cells to the population’s known composition. It is the technique that lets a skewed online panel still call an election, and HiveSight keeps the whole apparatus, swapping a language model into the estimation slot. Roughly 150 cells per geography, drawn from populace, the same calibrated microdata the rest of the stack stands on; for each cell the model is asked not to be a person but to estimate a distribution — across people like this, how do the answers spread? — and the cell-level estimates aggregate under calibrated weights.</w:t>
       </w:r>
     </w:p>
     <w:p>
@@ -7589,7 +7593,7 @@
         <w:t xml:space="preserve">Democracy for Realists</w:t>
       </w:r>
       <w:r>
-        <w:t xml:space="preserve">, Christopher Achen and Larry Bartels take the textbook story — informed citizens evaluate policies, choose the candidate whose platform fits their preferences, and elections translate the public’s will into government — and spend three hundred pages dismantling it as the</w:t>
+        <w:t xml:space="preserve">, Christopher Achen and Larry Bartels take the textbook story — informed citizens evaluate policies, choose the candidate whose platform fits their preferences, and elections translate the public’s will into government — and spend a book dismantling it as the</w:t>
       </w:r>
       <w:r>
         <w:t xml:space="preserve"> </w:t>
@@ -7650,7 +7654,7 @@
         <w:pStyle w:val="FirstParagraph"/>
       </w:pPr>
       <w:r>
-        <w:t xml:space="preserve">The last chapter measured what people think: a distribution of opinion, estimated and benchmarked. A distribution is only an input. What a democracy does with it is aggregation — millions of noisy, partial pictures of the world compressed into one binding decision — and this chapter is about what the noise does on the way in.</w:t>
+        <w:t xml:space="preserve">The last chapter estimated what people think: a distribution of opinion, estimated and benchmarked. A distribution is only an input. What a democracy does with it is aggregation — millions of noisy, partial pictures of the world compressed into one binding decision — and this chapter is about what the noise does on the way in.</w:t>
       </w:r>
     </w:p>
     <w:p>
@@ -8495,7 +8499,7 @@
         <w:pStyle w:val="FirstParagraph"/>
       </w:pPr>
       <w:r>
-        <w:t xml:space="preserve">If value forecasting ever earned admission on this book’s own terms — calibrated across variables, countries, and horizons; leakage-controlled; adversarially tested; graded forward rather than backtested — it would bear on the largest open question in AI: how systems that act on our behalf should weigh contested human values. Even then its role would be bounded: one input, evidence about where considered preferences might sit, never an authority over them. Today it has earned no such standing. What exists is a research question with one suggestive backtest, one humbling miss, one pre-registered replication in which nothing beat persistence, and one methodological caveat sitting under the whole series. If the work matures, its institutional shape is already described in this book: value forecasting is at bottom a forecasting problem — a probability distribution over what people will come to value, scored against what actually happens — exactly the kind of claim chapter 13’s docket exists to post with an interval and grade. The forward-registered forecasts for the 2026 and 2028 GSS waves are the first entries, and none has resolved. There is no track record here, only a method and a discipline for eventually being wrong in public.</w:t>
+        <w:t xml:space="preserve">If value forecasting ever earned admission on this book’s own terms — calibrated across variables, countries, and horizons; leakage-controlled; adversarially tested; graded forward rather than backtested — it would bear on the largest open question in AI: how systems that act on our behalf should weigh contested human values. Even then its role would be bounded: one input, evidence about where considered preferences might sit, never an authority over them. Today it has earned no such standing. What exists is a research question with one suggestive backtest, one humbling miss, one pre-registered replication in which nothing beat persistence, and one methodological caveat sitting under the whole series. If the work matures, its institutional shape is already described in this book: value forecasting is at bottom a forecasting problem — a probability distribution over what people will come to value, scored against what actually happens — exactly the kind of claim chapter 13’s docket exists to post with an interval and grade. The forward-registered forecasts for the 2026 and 2028 GSS waves would be its first entries; none has resolved. There is no track record here, only a method and a discipline for eventually being wrong in public.</w:t>
       </w:r>
     </w:p>
     <w:p>
@@ -8591,7 +8595,7 @@
         <w:pStyle w:val="FirstParagraph"/>
       </w:pPr>
       <w:r>
-        <w:t xml:space="preserve">A year ago, this chapter’s job was to describe what somebody would need to build. It reads differently now for a reason the preface confessed: chapters drafted in 2025 as descriptions of missing infrastructure had to be rewritten as field reports, the future tense overtaken by the past tense between one draft and the next. A book about the pace of change that was itself outrun by it is an awkward artifact, but an honest one — and the being-outrun is the most direct evidence for the claim that matters most here. The window in which this infrastructure gets built open or closed is not a generation away; it is now. So here is the ledger, scoped and dated as of July 2026: what exists, and then what does not.</w:t>
+        <w:t xml:space="preserve">A year ago, this chapter’s job was to describe what somebody would need to build. It reads differently now for a reason the preface confessed: a chapter drafted in 2025 as a description of missing infrastructure had to be rewritten as a field report, the future tense overtaken by the past tense between one draft and the next. A book about the pace of change that was itself outrun by it is an awkward artifact, but an honest one — and the being-outrun is the most direct evidence for the claim that matters most here. The window in which this infrastructure gets built open or closed is not a generation away; it is now. So here is the ledger, scoped and dated as of July 2026: what exists, and then what does not.</w:t>
       </w:r>
     </w:p>
     <w:p>
@@ -8645,15 +8649,15 @@
         <w:t xml:space="preserve"> </w:t>
       </w:r>
       <w:r>
-        <w:t xml:space="preserve">and the right one. Chapter 11 called that week the strongest evidence for the book’s thesis. It happened while the manuscript sat open.</w:t>
-      </w:r>
-    </w:p>
-    <w:p>
-      <w:pPr>
-        <w:pStyle w:val="BodyText"/>
-      </w:pPr>
-      <w:r>
-        <w:t xml:space="preserve">Beneath both views sits the data commons: populace, which assembles the calibrated population — synthetic households, tuned to administrative totals, that let a model represent anyone in the country rather than only the respondents a survey happened to reach. It is the successor to the enhanced survey files of chapter 7, and the answer to the asymmetry chapter 2 diagnosed: the government’s confidential records were never coming out from behind Section 6103, so the open stack synthesizes its own people and proves them against the totals everyone can see.</w:t>
+        <w:t xml:space="preserve">and the right one. That week is the strongest evidence this book has for its thesis, and it happened while the manuscript sat open.</w:t>
+      </w:r>
+    </w:p>
+    <w:p>
+      <w:pPr>
+        <w:pStyle w:val="BodyText"/>
+      </w:pPr>
+      <w:r>
+        <w:t xml:space="preserve">Beneath both views sits the data commons: populace, which assembles the calibrated population — synthetic households, tuned to administrative totals, that let a model represent anyone in the country rather than only the respondents a survey happened to reach. It is the successor to the enhanced survey files of chapter 6, and the answer to the asymmetry chapter 2 diagnosed: the government’s confidential records were never coming out from behind Section 6103, so the open stack synthesizes its own people and proves them against the totals everyone can see.</w:t>
       </w:r>
     </w:p>
     <w:p>
@@ -8669,15 +8673,15 @@
         <w:pStyle w:val="BodyText"/>
       </w:pPr>
       <w:r>
-        <w:t xml:space="preserve">And one project exists to measure the boundary the others defend. PolicyBench puts today’s best language models on a public board and scores them on complete household tax-and-benefit calculations. As of mid-2026, the best model still gets roughly one in six of those calculations wrong by more than a dollar, and most models miss a quarter or more — family-level errors, a wrong Medicaid eligibility or a wrong SNAP amount, not rounding slips. That measured gap is why the deterministic layer has to exist at all, and the board exists so the claim stays checkable as the models improve.</w:t>
-      </w:r>
-    </w:p>
-    <w:p>
-      <w:pPr>
-        <w:pStyle w:val="BodyText"/>
-      </w:pPr>
-      <w:r>
-        <w:t xml:space="preserve">The five entries are one structure pulled apart along its natural seams — the four questions of the introduction, given institutional homes with different verification loops. PolicyEngine keeps its name and its users; underneath, it is being recomposed into Axiom, which holds what the law says, and populace, which holds who the people are, with Thesis as the third pole for what will happen: the decomposition chapter 12 argued for, built in organizational form.</w:t>
+        <w:t xml:space="preserve">And one project exists to measure the boundary the others defend. PolicyBench puts today’s best language models on a public board and scores them on complete household tax-and-benefit calculations. As of mid-2026, the best model still gets roughly one in nine of those calculations wrong by more than a dollar, and the typical model misses about one in four — family-level errors, a wrong Medicaid eligibility or a wrong SNAP amount, not rounding slips. That measured gap is why the deterministic layer has to exist at all, and the board exists so the claim stays checkable as the models improve.</w:t>
+      </w:r>
+    </w:p>
+    <w:p>
+      <w:pPr>
+        <w:pStyle w:val="BodyText"/>
+      </w:pPr>
+      <w:r>
+        <w:t xml:space="preserve">The five entries are one structure pulled apart along its natural seams — three of the introduction’s four questions, given institutional homes with different verification loops; the fourth stays where the introduction left it, with the public. PolicyEngine keeps its name and its users; underneath, it is being recomposed into Axiom, which holds what the law says, and populace, which holds who the people are, with Thesis as the third pole for what will happen: the decomposition chapter 12 argued for, built in organizational form.</w:t>
       </w:r>
     </w:p>
     <w:p>
@@ -9873,7 +9877,6 @@
     <w:link w:val="VerbatimChar"/>
     <w:pPr>
       <w:wordWrap w:val="off"/>
-      <w:shd w:val="clear" w:fill="f1f3f5"/>
     </w:pPr>
   </w:style>
   <w:style w:type="character" w:customStyle="1" w:styleId="KeywordTok">
@@ -9881,104 +9884,93 @@
     <w:basedOn w:val="VerbatimChar"/>
     <w:rPr>
       <w:b/>
-      <w:color w:val="003b4f"/>
-      <w:shd w:val="clear" w:fill="f1f3f5"/>
+      <w:color w:val="007020"/>
     </w:rPr>
   </w:style>
   <w:style w:type="character" w:customStyle="1" w:styleId="DataTypeTok">
     <w:name w:val="DataTypeTok"/>
     <w:basedOn w:val="VerbatimChar"/>
     <w:rPr>
-      <w:color w:val="ad0000"/>
-      <w:shd w:val="clear" w:fill="f1f3f5"/>
+      <w:color w:val="902000"/>
     </w:rPr>
   </w:style>
   <w:style w:type="character" w:customStyle="1" w:styleId="DecValTok">
     <w:name w:val="DecValTok"/>
     <w:basedOn w:val="VerbatimChar"/>
     <w:rPr>
-      <w:color w:val="ad0000"/>
-      <w:shd w:val="clear" w:fill="f1f3f5"/>
+      <w:color w:val="40a070"/>
     </w:rPr>
   </w:style>
   <w:style w:type="character" w:customStyle="1" w:styleId="BaseNTok">
     <w:name w:val="BaseNTok"/>
     <w:basedOn w:val="VerbatimChar"/>
     <w:rPr>
-      <w:color w:val="ad0000"/>
-      <w:shd w:val="clear" w:fill="f1f3f5"/>
+      <w:color w:val="40a070"/>
     </w:rPr>
   </w:style>
   <w:style w:type="character" w:customStyle="1" w:styleId="FloatTok">
     <w:name w:val="FloatTok"/>
     <w:basedOn w:val="VerbatimChar"/>
     <w:rPr>
-      <w:color w:val="ad0000"/>
-      <w:shd w:val="clear" w:fill="f1f3f5"/>
+      <w:color w:val="40a070"/>
     </w:rPr>
   </w:style>
   <w:style w:type="character" w:customStyle="1" w:styleId="ConstantTok">
     <w:name w:val="ConstantTok"/>
     <w:basedOn w:val="VerbatimChar"/>
     <w:rPr>
-      <w:color w:val="8f5902"/>
-      <w:shd w:val="clear" w:fill="f1f3f5"/>
+      <w:color w:val="880000"/>
     </w:rPr>
   </w:style>
   <w:style w:type="character" w:customStyle="1" w:styleId="CharTok">
     <w:name w:val="CharTok"/>
     <w:basedOn w:val="VerbatimChar"/>
     <w:rPr>
-      <w:color w:val="20794d"/>
-      <w:shd w:val="clear" w:fill="f1f3f5"/>
+      <w:color w:val="4070a0"/>
     </w:rPr>
   </w:style>
   <w:style w:type="character" w:customStyle="1" w:styleId="SpecialCharTok">
     <w:name w:val="SpecialCharTok"/>
     <w:basedOn w:val="VerbatimChar"/>
     <w:rPr>
-      <w:color w:val="5e5e5e"/>
-      <w:shd w:val="clear" w:fill="f1f3f5"/>
+      <w:color w:val="4070a0"/>
     </w:rPr>
   </w:style>
   <w:style w:type="character" w:customStyle="1" w:styleId="StringTok">
     <w:name w:val="StringTok"/>
     <w:basedOn w:val="VerbatimChar"/>
     <w:rPr>
-      <w:color w:val="20794d"/>
-      <w:shd w:val="clear" w:fill="f1f3f5"/>
+      <w:color w:val="4070a0"/>
     </w:rPr>
   </w:style>
   <w:style w:type="character" w:customStyle="1" w:styleId="VerbatimStringTok">
     <w:name w:val="VerbatimStringTok"/>
     <w:basedOn w:val="VerbatimChar"/>
     <w:rPr>
-      <w:color w:val="20794d"/>
-      <w:shd w:val="clear" w:fill="f1f3f5"/>
+      <w:color w:val="4070a0"/>
     </w:rPr>
   </w:style>
   <w:style w:type="character" w:customStyle="1" w:styleId="SpecialStringTok">
     <w:name w:val="SpecialStringTok"/>
     <w:basedOn w:val="VerbatimChar"/>
     <w:rPr>
-      <w:color w:val="20794d"/>
-      <w:shd w:val="clear" w:fill="f1f3f5"/>
+      <w:color w:val="bb6688"/>
     </w:rPr>
   </w:style>
   <w:style w:type="character" w:customStyle="1" w:styleId="ImportTok">
     <w:name w:val="ImportTok"/>
     <w:basedOn w:val="VerbatimChar"/>
     <w:rPr>
-      <w:color w:val="00769e"/>
-      <w:shd w:val="clear" w:fill="f1f3f5"/>
+      <w:b/>
+      <w:color w:val="008000"/>
     </w:rPr>
   </w:style>
   <w:style w:type="character" w:customStyle="1" w:styleId="CommentTok">
     <w:name w:val="CommentTok"/>
     <w:basedOn w:val="VerbatimChar"/>
     <w:rPr>
-      <w:color w:val="5e5e5e"/>
-      <w:shd w:val="clear" w:fill="f1f3f5"/>
+      <w:i/>
+      <w:color w:val="60a0b0"/>
     </w:rPr>
   </w:style>
   <w:style w:type="character" w:customStyle="1" w:styleId="DocumentationTok">
@@ -9986,49 +9978,46 @@
     <w:basedOn w:val="VerbatimChar"/>
     <w:rPr>
       <w:i/>
-      <w:color w:val="5e5e5e"/>
-      <w:shd w:val="clear" w:fill="f1f3f5"/>
+      <w:color w:val="ba2121"/>
     </w:rPr>
   </w:style>
   <w:style w:type="character" w:customStyle="1" w:styleId="AnnotationTok">
     <w:name w:val="AnnotationTok"/>
     <w:basedOn w:val="VerbatimChar"/>
     <w:rPr>
-      <w:color w:val="5e5e5e"/>
-      <w:shd w:val="clear" w:fill="f1f3f5"/>
+      <w:b/>
+      <w:i/>
+      <w:color w:val="60a0b0"/>
     </w:rPr>
   </w:style>
   <w:style w:type="character" w:customStyle="1" w:styleId="CommentVarTok">
     <w:name w:val="CommentVarTok"/>
     <w:basedOn w:val="VerbatimChar"/>
     <w:rPr>
+      <w:b/>
       <w:i/>
-      <w:color w:val="5e5e5e"/>
-      <w:shd w:val="clear" w:fill="f1f3f5"/>
+      <w:color w:val="60a0b0"/>
     </w:rPr>
   </w:style>
   <w:style w:type="character" w:customStyle="1" w:styleId="OtherTok">
     <w:name w:val="OtherTok"/>
     <w:basedOn w:val="VerbatimChar"/>
     <w:rPr>
-      <w:color w:val="003b4f"/>
-      <w:shd w:val="clear" w:fill="f1f3f5"/>
+      <w:color w:val="007020"/>
     </w:rPr>
   </w:style>
   <w:style w:type="character" w:customStyle="1" w:styleId="FunctionTok">
     <w:name w:val="FunctionTok"/>
     <w:basedOn w:val="VerbatimChar"/>
     <w:rPr>
-      <w:color w:val="4758ab"/>
-      <w:shd w:val="clear" w:fill="f1f3f5"/>
+      <w:color w:val="06287e"/>
     </w:rPr>
   </w:style>
   <w:style w:type="character" w:customStyle="1" w:styleId="VariableTok">
     <w:name w:val="VariableTok"/>
     <w:basedOn w:val="VerbatimChar"/>
     <w:rPr>
-      <w:color w:val="111111"/>
-      <w:shd w:val="clear" w:fill="f1f3f5"/>
+      <w:color w:val="19177c"/>
     </w:rPr>
   </w:style>
   <w:style w:type="character" w:customStyle="1" w:styleId="ControlFlowTok">
@@ -10036,98 +10025,85 @@
     <w:basedOn w:val="VerbatimChar"/>
     <w:rPr>
       <w:b/>
-      <w:color w:val="003b4f"/>
-      <w:shd w:val="clear" w:fill="f1f3f5"/>
+      <w:color w:val="007020"/>
     </w:rPr>
   </w:style>
   <w:style w:type="character" w:customStyle="1" w:styleId="OperatorTok">
     <w:name w:val="OperatorTok"/>
     <w:basedOn w:val="VerbatimChar"/>
     <w:rPr>
-      <w:color w:val="5e5e5e"/>
-      <w:shd w:val="clear" w:fill="f1f3f5"/>
+      <w:color w:val="666666"/>
     </w:rPr>
   </w:style>
   <w:style w:type="character" w:customStyle="1" w:styleId="BuiltInTok">
     <w:name w:val="BuiltInTok"/>
     <w:basedOn w:val="VerbatimChar"/>
     <w:rPr>
-      <w:color w:val="003b4f"/>
-      <w:shd w:val="clear" w:fill="f1f3f5"/>
+      <w:color w:val="008000"/>
     </w:rPr>
   </w:style>
   <w:style w:type="character" w:customStyle="1" w:styleId="ExtensionTok">
     <w:name w:val="ExtensionTok"/>
     <w:basedOn w:val="VerbatimChar"/>
-    <w:rPr>
-      <w:color w:val="003b4f"/>
-      <w:shd w:val="clear" w:fill="f1f3f5"/>
-    </w:rPr>
+    <w:rPr/>
   </w:style>
   <w:style w:type="character" w:customStyle="1" w:styleId="PreprocessorTok">
     <w:name w:val="PreprocessorTok"/>
     <w:basedOn w:val="VerbatimChar"/>
     <w:rPr>
-      <w:color w:val="ad0000"/>
-      <w:shd w:val="clear" w:fill="f1f3f5"/>
+      <w:color w:val="bc7a00"/>
     </w:rPr>
   </w:style>
   <w:style w:type="character" w:customStyle="1" w:styleId="AttributeTok">
     <w:name w:val="AttributeTok"/>
     <w:basedOn w:val="VerbatimChar"/>
     <w:rPr>
-      <w:color w:val="657422"/>
-      <w:shd w:val="clear" w:fill="f1f3f5"/>
+      <w:color w:val="7d9029"/>
     </w:rPr>
   </w:style>
   <w:style w:type="character" w:customStyle="1" w:styleId="RegionMarkerTok">
     <w:name w:val="RegionMarkerTok"/>
     <w:basedOn w:val="VerbatimChar"/>
-    <w:rPr>
-      <w:color w:val="003b4f"/>
-      <w:shd w:val="clear" w:fill="f1f3f5"/>
-    </w:rPr>
+    <w:rPr/>
   </w:style>
   <w:style w:type="character" w:customStyle="1" w:styleId="InformationTok">
     <w:name w:val="InformationTok"/>
     <w:basedOn w:val="VerbatimChar"/>
     <w:rPr>
-      <w:color w:val="5e5e5e"/>
-      <w:shd w:val="clear" w:fill="f1f3f5"/>
+      <w:b/>
+      <w:i/>
+      <w:color w:val="60a0b0"/>
     </w:rPr>
   </w:style>
   <w:style w:type="character" w:customStyle="1" w:styleId="WarningTok">
     <w:name w:val="WarningTok"/>
     <w:basedOn w:val="VerbatimChar"/>
     <w:rPr>
+      <w:b/>
       <w:i/>
-      <w:color w:val="5e5e5e"/>
-      <w:shd w:val="clear" w:fill="f1f3f5"/>
+      <w:color w:val="60a0b0"/>
     </w:rPr>
   </w:style>
   <w:style w:type="character" w:customStyle="1" w:styleId="AlertTok">
     <w:name w:val="AlertTok"/>
     <w:basedOn w:val="VerbatimChar"/>
     <w:rPr>
-      <w:color w:val="ad0000"/>
-      <w:shd w:val="clear" w:fill="f1f3f5"/>
+      <w:b/>
+      <w:color w:val="ff0000"/>
     </w:rPr>
   </w:style>
   <w:style w:type="character" w:customStyle="1" w:styleId="ErrorTok">
     <w:name w:val="ErrorTok"/>
     <w:basedOn w:val="VerbatimChar"/>
     <w:rPr>
-      <w:color w:val="ad0000"/>
-      <w:shd w:val="clear" w:fill="f1f3f5"/>
+      <w:b/>
+      <w:color w:val="ff0000"/>
     </w:rPr>
   </w:style>
   <w:style w:type="character" w:customStyle="1" w:styleId="NormalTok">
     <w:name w:val="NormalTok"/>
     <w:basedOn w:val="VerbatimChar"/>
-    <w:rPr>
-      <w:color w:val="003b4f"/>
-      <w:shd w:val="clear" w:fill="f1f3f5"/>
-    </w:rPr>
+    <w:rPr/>
   </w:style>
 </w:styles>
 </file>

</xml_diff>

<commit_message>
Rebuild exports after the editorial pass
Co-Authored-By: Claude Fable 5 <noreply@anthropic.com>
</commit_message>
<xml_diff>
--- a/exports/society-in-silico-listen.docx
+++ b/exports/society-in-silico-listen.docx
@@ -46,7 +46,7 @@
         <w:pStyle w:val="FirstParagraph"/>
       </w:pPr>
       <w:r>
-        <w:t xml:space="preserve">In 2019 I wanted a number nobody would give me. The question was simple to state: if the United States paid every adult a basic income, how many families would that pull over the poverty line, and what would it cost once you netted out the programs it replaced? Congress had models that could answer it — the Congressional Budget Office’s, the Joint Committee on Taxation’s. So did the Treasury, and, outside government, the Tax Policy Center. I could read their reports. I could not ask their models my question, because the models lived behind institutional walls, most ran on confidential data, and all answered only to their owners.</w:t>
+        <w:t xml:space="preserve">In 2019 I wanted a number nobody would give me. The question was simple to state: if the United States paid every adult a basic income, how many families would that pull over the poverty line, and what would it cost once you netted out the programs it replaced? Washington had models that could answer it — the Congressional Budget Office’s, the Joint Committee on Taxation’s, the Treasury’s; outside government, the Tax Policy Center had one too. I could read their reports. I could not ask their models my question, because the models lived behind institutional walls, most ran on confidential data, and all answered only to their owners.</w:t>
       </w:r>
     </w:p>
     <w:p>
@@ -188,7 +188,7 @@
         <w:pStyle w:val="BodyText"/>
       </w:pPr>
       <w:r>
-        <w:t xml:space="preserve">You can judge for yourself whether the open path holds up. The evidence is all here, marked with exactly how much I trust it.</w:t>
+        <w:t xml:space="preserve">The number nobody would give me in 2019 is now anyone’s to compute — in a browser, with the machinery in plain sight.</w:t>
       </w:r>
     </w:p>
     <w:p>
@@ -310,7 +310,7 @@
         <w:pStyle w:val="BodyText"/>
       </w:pPr>
       <w:r>
-        <w:t xml:space="preserve">Researchers had seen it coming. In 2023, a Johns Hopkins and Maryland team found GPT-4 answered only 67 percent of true-or-false tax questions correctly — better than a coin, useless for a filing. And it has not aged away. By mid-2026, PolicyEngine’s own benchmark, PolicyBench, was scoring two dozen frontier and open models on complete household tax-and-benefit calculations; the best model still got roughly one in nine households wrong by more than a dollar, and the typical model missed about one in four. These are not rounding slips. A miss means the model told a family the wrong Medicaid eligibility or the wrong food-assistance amount.</w:t>
+        <w:t xml:space="preserve">Researchers had seen it coming. In 2023, a Johns Hopkins and Maryland team found GPT-4 answered only 67 percent of true-or-false tax questions correctly — better than a coin, useless for a filing. And it has not aged away. By mid-2026, PolicyEngine’s own benchmark, PolicyBench, was scoring two dozen frontier and open models on complete household tax-and-benefit calculations; the best model still got roughly one in nine households wrong by more than a dollar, and the typical model missed about one in four. A dollar sounds like a rounding slip until you see what the misses are: the wrong Medicaid eligibility, the wrong food-assistance amount.</w:t>
       </w:r>
     </w:p>
     <w:p>
@@ -360,23 +360,23 @@
         <w:pStyle w:val="BodyText"/>
       </w:pPr>
       <w:r>
-        <w:t xml:space="preserve">AI became the interface. When someone wonders how much Child Tax Credit they will get, they increasingly ask a chatbot, not IRS.gov. Whatever the assistant says, someone may act on. The infrastructure those assistants should consult — accurate, current, citable — either exists as public plumbing or every AI company improvises its own, badly.</w:t>
-      </w:r>
-    </w:p>
-    <w:p>
-      <w:pPr>
-        <w:pStyle w:val="BodyText"/>
-      </w:pPr>
-      <w:r>
-        <w:t xml:space="preserve">Policy complexity kept compounding. The tax code has roughly doubled in length since 1985, and it interlocks with dozens of benefit programs whose rules shift by state and by year. A single parent earning $35,000 faces genuinely different arithmetic in Texas and New York, and the difference can run to thousands of dollars. No unaided human navigates this; the question is only which computer helps, and who can see inside it.</w:t>
-      </w:r>
-    </w:p>
-    <w:p>
-      <w:pPr>
-        <w:pStyle w:val="BodyText"/>
-      </w:pPr>
-      <w:r>
-        <w:t xml:space="preserve">And open modeling grew up. What began as academic code became working infrastructure: by 2025 PolicyEngine covered federal taxes plus all fifty states, the United Kingdom, and Canada, built by more than a hundred contributors; EUROMOD spanned twenty-seven European countries; OpenFisca ran on four continents. The question stopped being whether open policy simulation could work and became whether it would be the shared foundation — for AI systems, for governments, for citizens — or a curiosity beside the closed models that still decide budgets.</w:t>
+        <w:t xml:space="preserve">When someone wonders how much Child Tax Credit they will get, they increasingly ask a chatbot, not IRS.gov: AI became the interface. Whatever the assistant says, someone may act on. The infrastructure those assistants should consult — accurate, current, citable — either exists as public plumbing or every AI company improvises its own, badly.</w:t>
+      </w:r>
+    </w:p>
+    <w:p>
+      <w:pPr>
+        <w:pStyle w:val="BodyText"/>
+      </w:pPr>
+      <w:r>
+        <w:t xml:space="preserve">The rules those assistants must navigate kept compounding. The tax code has roughly doubled in length since 1985, and it interlocks with dozens of benefit programs whose rules shift by state and by year. A single parent earning $35,000 faces genuinely different arithmetic in Texas and New York, and the difference can run to thousands of dollars. No unaided human navigates this; the question is only which computer helps, and who can see inside it.</w:t>
+      </w:r>
+    </w:p>
+    <w:p>
+      <w:pPr>
+        <w:pStyle w:val="BodyText"/>
+      </w:pPr>
+      <w:r>
+        <w:t xml:space="preserve">And the answer to both was growing up in public. What began as academic code became working infrastructure: by 2025 PolicyEngine covered federal taxes plus all fifty states, the United Kingdom, and Canada, built by more than a hundred contributors; EUROMOD spanned twenty-seven European countries; OpenFisca ran on four continents. The question stopped being whether open policy simulation could work and became whether it would be the shared foundation — for AI systems, for governments, for citizens — or a curiosity beside the closed models that still decide budgets.</w:t>
       </w:r>
     </w:p>
     <w:bookmarkEnd w:id="16"/>
@@ -468,19 +468,7 @@
         <w:t xml:space="preserve"> </w:t>
       </w:r>
       <w:r>
-        <w:t xml:space="preserve">Uncertainty can be printed instead of hidden — not</w:t>
-      </w:r>
-      <w:r>
-        <w:t xml:space="preserve"> </w:t>
-      </w:r>
-      <w:r>
-        <w:t xml:space="preserve">“this costs $4.5 trillion”</w:t>
-      </w:r>
-      <w:r>
-        <w:t xml:space="preserve"> </w:t>
-      </w:r>
-      <w:r>
-        <w:t xml:space="preserve">but</w:t>
+        <w:t xml:space="preserve">Uncertainty can be printed instead of hidden:</w:t>
       </w:r>
       <w:r>
         <w:t xml:space="preserve"> </w:t>
@@ -656,7 +644,7 @@
         <w:pStyle w:val="FirstParagraph"/>
       </w:pPr>
       <w:r>
-        <w:t xml:space="preserve">Two warnings before we start. I built many of the tools this book describes, and I am not a neutral witness; where the work is mine, I say so, and where it failed, I show the failure. And the boundary between</w:t>
+        <w:t xml:space="preserve">Two warnings before we start. I built many of the tools this book describes — PolicyEngine, the PolicyBench benchmark, the HiveSight and Democrasim experiments of Parts IV and V — and I am not a neutral witness; where the work is mine, I say so, and where it failed, I show the failure. And the boundary between</w:t>
       </w:r>
       <w:r>
         <w:t xml:space="preserve"> </w:t>
@@ -770,7 +758,7 @@
         <w:pStyle w:val="BodyText"/>
       </w:pPr>
       <w:r>
-        <w:t xml:space="preserve">The idea arrived in three acts, and the dates matter. In 1957 Orcutt proposed it. In 1961 he and three co-authors published a working demonstration — limited, but running. In 1975 the Urban Institute completed DYNASIM, the first full-scale version, eighteen years after the proposal. Everything this book describes descends from those three dates, so it is worth understanding what Orcutt saw that made him spend a career on the gap between them.</w:t>
+        <w:t xml:space="preserve">The idea arrived in three acts. In 1957 Orcutt proposed it. In 1961 he and three co-authors published a working demonstration — limited, but running. In 1975 the Urban Institute completed DYNASIM, the first full-scale version, eighteen years after the proposal. Whatever Orcutt saw in 1957, he judged it worth a career.</w:t>
       </w:r>
     </w:p>
     <w:bookmarkStart w:id="22" w:name="the-engineer"/>
@@ -1376,7 +1364,7 @@
         <w:t xml:space="preserve"> </w:t>
       </w:r>
       <w:r>
-        <w:t xml:space="preserve">is doing heavy work in that sentence. When a senator drafts a tax amendment, JCT staff feed it into the models, which apply the proposed rules to a large, confidential sample of actual tax returns; within days, sometimes hours, out comes a score — the projected change in federal revenue over ten years. That single number decides whether the amendment fits the budget resolution, survives reconciliation, or is fiscally viable at all. A score too high kills a proposal before any vote. This is budget scoring: not a commentary on legislation but a gate it must pass through, operated by a model most members of Congress have never seen.</w:t>
+        <w:t xml:space="preserve">is doing heavy work in that sentence. When a senator drafts a tax amendment, JCT staff feed it into the models, which apply the proposed rules to a large, confidential sample of actual tax returns; within days, sometimes hours, out comes a score — the projected change in federal revenue over ten years. That single number decides whether the amendment fits the budget resolution, survives reconciliation, or is fiscally viable at all. A score too high kills a proposal before any vote. This is budget scoring: a gate legislation must pass through, operated by a model most members of Congress have never seen.</w:t>
       </w:r>
     </w:p>
     <w:p>
@@ -1401,7 +1389,7 @@
         <w:pStyle w:val="BodyText"/>
       </w:pPr>
       <w:r>
-        <w:t xml:space="preserve">And because taxes were only half the ledger, the Urban Institute — Orcutt’s old home — ran the TRIM series, updated every year from the Current Population Survey to model the programs the tax models left out: SNAP, Medicaid, TANF, SSI, housing assistance. It captured the interaction between taxes and transfers, the thing TAXBEN had shown mattered. It served government agencies under contract, not the public.</w:t>
+        <w:t xml:space="preserve">And because taxes were only half the ledger, the Urban Institute — Orcutt’s old home — ran the TRIM series, updated every year from the Current Population Survey to model the programs the tax models left out: SNAP, Medicaid, TANF, SSI, housing assistance. It captured the interaction between taxes and transfers, the thing TAXBEN had shown mattered. It served government agencies under contract; the public had no access.</w:t>
       </w:r>
     </w:p>
     <w:p>
@@ -1459,7 +1447,7 @@
         <w:pStyle w:val="BodyText"/>
       </w:pPr>
       <w:r>
-        <w:t xml:space="preserve">The rest of this chapter is the fifty-year campaign against that arrangement — waged not by breaching the moat, which the law forbids, but by rebuilding, in public, nearly everything inside it.</w:t>
+        <w:t xml:space="preserve">The rest of this chapter is the fifty-year campaign against that arrangement. The law forbids breaching the moat, so the outsiders rebuilt, in public, nearly everything inside it.</w:t>
       </w:r>
     </w:p>
     <w:bookmarkEnd w:id="31"/>
@@ -1485,7 +1473,7 @@
         <w:pStyle w:val="BodyText"/>
       </w:pPr>
       <w:r>
-        <w:t xml:space="preserve">The institution built for the fights came in 2002, when Gene Steuerle, Len Burman, and William Gale founded the Tax Policy Center as a joint venture of the Urban Institute and the Brookings Institution. The founders were poachers turned gamekeepers in reverse: Steuerle had helped build the official models at Treasury, Burman at CBO and Treasury. TPC built its microsimulation on the same public-use files available to everyone outside government — less granular than the confidential returns, but enough to estimate the revenue and distributional effects of a proposal within days.</w:t>
+        <w:t xml:space="preserve">The institution built for the fights came in 2002, when Gene Steuerle, Len Burman, and William Gale founded the Tax Policy Center as a joint venture of the Urban Institute and the Brookings Institution. The founders knew the machine from the inside: Steuerle had helped build the official models at Treasury, Burman at CBO and Treasury. TPC built its microsimulation on the same public-use files available to everyone outside government — less granular than the confidential returns, but enough to estimate the revenue and distributional effects of a proposal within days.</w:t>
       </w:r>
     </w:p>
     <w:p>
@@ -1716,7 +1704,7 @@
         <w:pStyle w:val="BodyText"/>
       </w:pPr>
       <w:r>
-        <w:t xml:space="preserve">Four months after the book appeared, a small team inside the French government’s own strategy unit — the Centre d’analyse stratégique, later renamed France Stratégie — began building something quieter and more consequential: OpenFisca, written by Mahdi Ben Jelloul and Clément Schaff, released to the public later that year. It was not a simulator but the source code beneath one, built on the premise that a country’s tax and benefit rules should exist as executable code, not only as legal prose. Where the révolution fiscale site opened one model’s</w:t>
+        <w:t xml:space="preserve">Four months after the book appeared, a small team inside the French government’s own strategy unit — the Centre d’analyse stratégique, later renamed France Stratégie — began building something quieter and more consequential: OpenFisca, written by Mahdi Ben Jelloul and Clément Schaff, released to the public later that year. It was the source code beneath a simulator, built on the premise that a country’s tax and benefit rules should exist as executable code alongside the legal prose. Where the révolution fiscale site opened one model’s</w:t>
       </w:r>
       <w:r>
         <w:t xml:space="preserve"> </w:t>
@@ -1901,7 +1889,7 @@
         <w:pStyle w:val="BodyText"/>
       </w:pPr>
       <w:r>
-        <w:t xml:space="preserve">There is exactly one answer the constraint permits, and it is the strategy the rest of this book builds on. Take the public files you are allowed to hold. Synthesize from them an artificial population — households that exist only in silicon. Then calibrate it: adjust each record’s weight, the number of real households it stands for, until the weighted totals reproduce the administrative aggregates the government does publish — total returns filed, total wages by bracket, total SNAP enrollment by state. The government will not show you the microdata, but it publishes thousands of true totals about it, and each one is a constraint an artificial population can be forced to satisfy. Statistics Canada had proven a version of the idea decades earlier, shipping its SPSD/M model on exactly such a synthetic database; the strategy was not unimaginable, just unbuilt at the scale and openness the moment now demands.</w:t>
+        <w:t xml:space="preserve">There is exactly one answer the constraint permits, and it is the strategy the rest of this book builds on. Take the public files you are allowed to hold. Synthesize from them an artificial population — households that exist only in silicon. Then calibrate it: adjust each record’s weight, the number of real households it stands for, until the weighted totals reproduce the administrative aggregates the government does publish — total returns filed, total wages by bracket, total SNAP enrollment by state. The government will not show you the microdata, but it publishes thousands of true totals about it, and each one is a constraint an artificial population can be forced to satisfy. Statistics Canada had proven a version of the idea decades earlier, shipping its SPSD/M model on exactly such a synthetic database; what remained was to build it at the scale and openness the moment now demands.</w:t>
       </w:r>
     </w:p>
     <w:p>
@@ -1980,14 +1968,6 @@
         <w:t xml:space="preserve">is the best anyone can honestly say.</w:t>
       </w:r>
     </w:p>
-    <w:p>
-      <w:pPr>
-        <w:pStyle w:val="BodyText"/>
-      </w:pPr>
-      <w:r>
-        <w:t xml:space="preserve">This chapter is about what that sentence means — how you would know whether a model of society is right, what the record actually shows, and the discipline the answer imposes on every page that follows.</w:t>
-      </w:r>
-    </w:p>
     <w:bookmarkStart w:id="39" w:name="three-ways-to-be-right"/>
     <w:p>
       <w:pPr>
@@ -2026,7 +2006,7 @@
         <w:pStyle w:val="BodyText"/>
       </w:pPr>
       <w:r>
-        <w:t xml:space="preserve">The third is predictive validation: when the model forecast the effect of a change, did the forecast hold? This is the hard one, and not because modelers are careless. A policy change never arrives alone; it lands bundled with economic shifts, other reforms, and behavioral responses nobody anticipated, and the model’s error is tangled with everything else that happened.</w:t>
+        <w:t xml:space="preserve">The third is predictive validation: when the model forecast the effect of a change, did the forecast hold? This is the hard one. A policy change never arrives alone; it lands bundled with economic shifts, other reforms, and behavioral responses nobody anticipated, and the model’s error is tangled with everything else that happened.</w:t>
       </w:r>
     </w:p>
     <w:p>
@@ -2141,7 +2121,7 @@
         <w:pStyle w:val="BodyText"/>
       </w:pPr>
       <w:r>
-        <w:t xml:space="preserve">Both readings of this episode are true, and the book needs both. Read generously: predicting a national coverage rate within a point, six years out, through a Supreme Court shock, is a real achievement no rule of thumb could match. Read strictly: an aggregate that lands while its components miss has passed the second validation level by partial cancellation, not the first — and a decomposition performed years later, with the answers in hand, is not the same thing as the original forecast being right. A number that comes out right for the wrong reasons has not been validated; it has been lucky, and luck does not generalize. The only way to know which you have is to check the components — which is exactly why the levels are ordered the way they are.</w:t>
+        <w:t xml:space="preserve">Both readings of this episode are true, and the book needs both. Read generously: predicting a national coverage rate within a point, six years out, through a Supreme Court shock, is a real achievement no rule of thumb could match. Read strictly: an aggregate that lands while its components miss has passed the second validation level by partial cancellation while failing the first — and a decomposition performed years later, with the answers in hand, is not the same thing as the original forecast being right. A number that comes out right for the wrong reasons has not been validated; it has been lucky, and luck does not generalize. The only way to know which you have is to check the components — which is exactly why the levels are ordered the way they are.</w:t>
       </w:r>
     </w:p>
     <w:bookmarkEnd w:id="40"/>
@@ -2159,7 +2139,7 @@
         <w:pStyle w:val="FirstParagraph"/>
       </w:pPr>
       <w:r>
-        <w:t xml:space="preserve">The CBO does something most forecasting institutions never do: it grades its own work in public, publishing systematic retrospectives that compare past projections against what happened. The retrospectives show real improvement. For deficit projections six years out, the average absolute error fell from 3.2 percent of GDP over 1989–2001 to 1.0 percent over 2002–2019 — a threefold gain in two decades, built on richer IRS administrative data, more capable computing, and the retrospectives themselves, which exposed systematic biases that could then be corrected. Self-grading is not a courtesy; it is the feedback loop that makes improvement possible, and the agencies that skip it stay exactly as wrong as they started.</w:t>
+        <w:t xml:space="preserve">The CBO does something most forecasting institutions never do: it grades its own work in public, publishing systematic retrospectives that compare past projections against what happened. The retrospectives show real improvement. For deficit projections six years out, the average absolute error fell from 3.2 percent of GDP over 1989–2001 to 1.0 percent over 2002–2019 — a threefold gain in two decades, built on richer IRS administrative data, more capable computing, and the retrospectives themselves, which exposed systematic biases that could then be corrected. Self-grading is the feedback loop that makes improvement possible; the agencies that skip it stay exactly as wrong as they started.</w:t>
       </w:r>
     </w:p>
     <w:p>
@@ -2175,7 +2155,7 @@
         <w:pStyle w:val="BodyText"/>
       </w:pPr>
       <w:r>
-        <w:t xml:space="preserve">Then there is the finding I like least and trust most. Kevin Kliesen and Daniel Thornton, economists at the Federal Reserve Bank of St. Louis, analyzed CBO forecasts published from 1976 to 2007 and found that a random walk — assume next year’s deficit simply equals this year’s — would have beaten the CBO on average, over both short and medium horizons. I cite this against my own interest, since this book spends several chapters on forecasting infrastructure. The right reading is not that CBO is incompetent; it is that deficit forecasting is saturated with irreducible uncertainty — recessions, crises, and pandemics are precisely the events no model foresees — and that beating a naive baseline is genuinely hard. Computing a household’s taxes under known law and predicting next year’s deficit are different problems wearing the same word</w:t>
+        <w:t xml:space="preserve">Then there is the finding I like least and trust most. Kevin Kliesen and Daniel Thornton, economists at the Federal Reserve Bank of St. Louis, analyzed CBO forecasts published from 1976 to 2007 and found that a random walk — assume next year’s deficit simply equals this year’s — would have beaten the CBO on average, over both short and medium horizons. I cite this against my own interest, since this book spends several chapters on forecasting infrastructure. The right reading says less about CBO than about the problem: deficit forecasting is saturated with irreducible uncertainty — recessions, crises, and pandemics are precisely the events no model foresees — and beating a naive baseline is genuinely hard. Computing a household’s taxes under known law and predicting next year’s deficit are different problems wearing the same word</w:t>
       </w:r>
       <w:r>
         <w:t xml:space="preserve"> </w:t>
@@ -2205,7 +2185,7 @@
         <w:pStyle w:val="FirstParagraph"/>
       </w:pPr>
       <w:r>
-        <w:t xml:space="preserve">If forecasting is the weak flank, it is worth asking who does it well. One answer that actually gets graded: markets where people bet. An NBER study of prediction markets found their forecasts</w:t>
+        <w:t xml:space="preserve">If forecasting is the weak flank, who does it well? One answer that actually gets graded: markets where people bet. An NBER study of prediction markets found their forecasts</w:t>
       </w:r>
       <w:r>
         <w:t xml:space="preserve"> </w:t>
@@ -2217,7 +2197,15 @@
         <w:t xml:space="preserve"> </w:t>
       </w:r>
       <w:r>
-        <w:t xml:space="preserve">than survey forecasts — the study’s own careful phrase — across GDP, inflation, and employment. The Monday before the 2024 presidential vote, with polls showing a coin flip, Polymarket had Donald Trump at 58 percent. Academic comparisons of market prices against FiveThirtyEight’s model found the markets competitive or better. For Federal Reserve decisions, Good Judgment’s superforecasters reportedly beat financial futures markets by about 30 percent in 2024–2025. Behind that last result sits Philip Tetlock’s two decades of evidence: most experts forecast little better than chance, but a small minority — roughly 2 percent of Good Judgment Project participants — consistently outperform, by updating often, thinking in probabilities, and refusing to marry a prediction to an ideology.</w:t>
+        <w:t xml:space="preserve">than survey forecasts — the study’s own careful phrase — across GDP, inflation, and employment. The Monday before the 2024 presidential vote, with polls showing a coin flip, Polymarket had Donald Trump at 58 percent. Academic comparisons of market prices against FiveThirtyEight’s model found the markets competitive or better.</w:t>
+      </w:r>
+    </w:p>
+    <w:p>
+      <w:pPr>
+        <w:pStyle w:val="BodyText"/>
+      </w:pPr>
+      <w:r>
+        <w:t xml:space="preserve">The other answer is a particular kind of person. For Federal Reserve decisions, Good Judgment’s superforecasters reportedly beat financial futures markets by about 30 percent in 2024–2025. Behind that result sits Philip Tetlock’s two decades of evidence: most experts forecast little better than chance, but a small minority — roughly 2 percent of Good Judgment Project participants — consistently outperform, by updating often, thinking in probabilities, and refusing to marry a prediction to an ideology.</w:t>
       </w:r>
     </w:p>
     <w:p>
@@ -2313,7 +2301,7 @@
         <w:pStyle w:val="BodyText"/>
       </w:pPr>
       <w:r>
-        <w:t xml:space="preserve">The lesson generalizes: accuracy is as much a property of inputs as of equations. Getting the rules exactly right — chapter 2’s project — buys nothing if the population you run them over is a funhouse mirror of the country. That is why the synthesize-and-calibrate strategy the last chapter ended with is not an optimization but a load-bearing wall, and why so much of Part II is about data rather than rules.</w:t>
+        <w:t xml:space="preserve">The lesson generalizes: accuracy is as much a property of inputs as of equations. Getting the rules exactly right — chapter 2’s project — buys nothing if the population you run them over is a funhouse mirror of the country. That is why the synthesize-and-calibrate strategy the last chapter ended with is a load-bearing wall, and why so much of Part II is about data rather than rules.</w:t>
       </w:r>
     </w:p>
     <w:bookmarkEnd w:id="43"/>
@@ -2399,7 +2387,7 @@
         <w:pStyle w:val="FirstParagraph"/>
       </w:pPr>
       <w:r>
-        <w:t xml:space="preserve">In 2017 the CBO estimated that repealing the ACA under the American Health Care Act would cost 23 million people their coverage by 2026. The bill failed, partly on the strength of that number. So the prediction was never tested — and never can be. This is not a gap in the CBO’s method; it is the logical structure of the genre. Enact a reform and the world without it goes unobserved; reject it and the world with it does. A counterfactual cannot be checked against reality, because being unrealized is what makes it a counterfactual.</w:t>
+        <w:t xml:space="preserve">In 2017 the CBO estimated that repealing the ACA under the American Health Care Act would cost 23 million people their coverage by 2026. The bill failed, partly on the strength of that number. So the prediction was never tested — and never can be. The genre is built that way. Enact a reform and the world without it goes unobserved; reject it and the world with it does. A counterfactual cannot be checked against reality, because being unrealized is what makes it a counterfactual.</w:t>
       </w:r>
     </w:p>
     <w:p>
@@ -2900,15 +2888,7 @@
         <w:pStyle w:val="FirstParagraph"/>
       </w:pPr>
       <w:r>
-        <w:t xml:space="preserve">By late 2020, Nikhil Woodruff and I had a working microsimulation model of the UK tax and benefit system, built at the UBI Center. Nikhil — the University College London undergraduate reading mathematics and computer science whom chapter 4 introduced, and the stronger engineer of the two of us — had led the build. The model, OpenFisca UK, could calculate taxes, simulate benefits, and estimate what a reform would do. It could do all of that only inside Python scripts that a programmer could run, which made it one more instance of the pattern we saw everywhere we looked: TAXSIM wanted batch files, Tax-Calculator wanted Python, UKMOD was built for academics, TAXBEN was proprietary. Serious tools, locked behind technical barriers.</w:t>
-      </w:r>
-    </w:p>
-    <w:p>
-      <w:pPr>
-        <w:pStyle w:val="BodyText"/>
-      </w:pPr>
-      <w:r>
-        <w:t xml:space="preserve">So we set the goal that defined the next five years: put the full power of microsimulation in a web browser, so that anyone could design a reform, see what it costs and who it helps, and check what it does to their own household, without writing a line of code.</w:t>
+        <w:t xml:space="preserve">By late 2020, Nikhil Woodruff and I had a working microsimulation model of the UK tax and benefit system, built at the UBI Center. Nikhil — the college student chapter 4 introduced — had led the build; he was a University College London undergraduate reading mathematics and computer science, and the stronger engineer of the two of us. The model, OpenFisca UK, could calculate taxes, simulate benefits, and estimate what a reform would do. It could do all of that only inside Python scripts that a programmer could run, which made it one more instance of the pattern we saw everywhere we looked: TAXSIM wanted batch files, Tax-Calculator wanted Python, UKMOD was built for academics, TAXBEN was proprietary. Serious tools, locked behind technical barriers. So we set the goal that defined the next five years: put the full power of microsimulation in a web browser, so that anyone could design a reform, see what it costs and who it helps, and check what it does to their own household, without writing a line of code.</w:t>
       </w:r>
     </w:p>
     <w:p>
@@ -2998,7 +2978,7 @@
         <w:pStyle w:val="BodyText"/>
       </w:pPr>
       <w:r>
-        <w:t xml:space="preserve">We started with what we could model — federal income and payroll taxes, SNAP, the EITC — and shipped the household calculator first. In July 2022 we added population-level impacts, computed on the Current Population Survey, the same microdata foundation behind official government estimates. State coverage came one state at a time. Some states piggyback on federal adjusted gross income and fall into place almost automatically once the federal model exists. Others are miniature ecosystems — New York alone has multiple income tax schedules, city taxes, and supplemental credits — and encoding one rarely transferred to the next. By the end of 2022 we had modeled six states. Forty-four remained. The constraint was structural: we wanted comprehensive, always-current coverage, and we had a small volunteer team encoding rules on weekends — a contributor might encode Oregon’s working-family credit only to find the legislature had amended the eligibility rules mid-session, with no updated documentation to encode from. Anyone could submit a pull request adding a state, and we reviewed for accuracy and code quality; the model worked wherever a local expert volunteered and failed wherever none did. Coverage tracked contributor geography, not policy importance. That is what open cost: the map filled in where the enthusiasm was, not where the need was.</w:t>
+        <w:t xml:space="preserve">We started with what we could model — federal income and payroll taxes, SNAP, the EITC — and shipped the household calculator first. In July 2022 we added population-level impacts, computed on the Current Population Survey, the same microdata foundation behind official government estimates. State coverage came one state at a time. Some states piggyback on federal adjusted gross income and fall into place almost automatically once the federal model exists. Others are miniature ecosystems — New York alone has multiple income tax schedules, city taxes, and supplemental credits — and encoding one rarely transferred to the next. By the end of 2022 we had modeled six states. Forty-four remained. The constraint was structural: we wanted comprehensive, always-current coverage, and we had a small volunteer team encoding rules on weekends — a contributor might encode Oregon’s working-family credit only to find the legislature had amended the eligibility rules mid-session, with no updated documentation to encode from. Anyone could submit a pull request adding a state, and we reviewed for accuracy and code quality; the model worked wherever a local expert volunteered and failed wherever none did. That is what open cost: the map filled in where the enthusiasm was, not where the need was.</w:t>
       </w:r>
     </w:p>
     <w:bookmarkEnd w:id="56"/>
@@ -3108,7 +3088,15 @@
         <w:pStyle w:val="BodyText"/>
       </w:pPr>
       <w:r>
-        <w:t xml:space="preserve">In September 2025 we signed a memorandum of understanding with the National Bureau of Economic Research to build an open-source emulator of TAXSIM, the calculator that had powered academic tax research since the 1970s; more than 1,200 published papers had relied on it. Daniel Feenberg, TAXSIM’s creator, joined our advisory board and served as external mentor under the NSF grant. The emulator’s purpose was partly preservation — researchers keep TAXSIM’s capabilities whatever happens to any one institution — and partly something more interesting: a framework in which several independently developed models cross-check one another. A month later we signed a second MOU, with the Federal Reserve Bank of Atlanta, whose Policy Rules Database — built with the National Center for Children in Poverty — covers the benefit side TAXSIM never touched: SNAP, Medicaid, housing vouchers, childcare subsidies. The database powers the Atlanta Fed’s CLIFF tools, which Colorado’s Workforce Development Council and New Mexico’s Caregivers Coalition use to help families see how earning more would affect their benefits. Three independently developed models — PolicyEngine, TAXSIM, the Policy Rules Database — meant that agreement builds trust, and divergence isolates where a discrepancy originates: it stops being</w:t>
+        <w:t xml:space="preserve">In September 2025 we signed a memorandum of understanding with the National Bureau of Economic Research to build an open-source emulator of TAXSIM, the calculator that had powered academic tax research since the 1970s; more than 1,200 published papers had relied on it. Daniel Feenberg, TAXSIM’s creator, joined our advisory board and served as external mentor under the NSF grant. The emulator’s purpose was partly preservation — researchers keep TAXSIM’s capabilities whatever happens to any one institution — and partly something more interesting: a framework in which several independently developed models cross-check one another.</w:t>
+      </w:r>
+    </w:p>
+    <w:p>
+      <w:pPr>
+        <w:pStyle w:val="BodyText"/>
+      </w:pPr>
+      <w:r>
+        <w:t xml:space="preserve">A month later we signed a second MOU, with the Federal Reserve Bank of Atlanta, whose Policy Rules Database, built with the National Center for Children in Poverty, covers the benefit side TAXSIM never touched: SNAP, Medicaid, housing vouchers, childcare subsidies. The database powers the Atlanta Fed’s CLIFF tools, which Colorado’s Workforce Development Council and New Mexico’s Caregivers Coalition use to help families see how earning more would affect their benefits. With three independently developed models — PolicyEngine, TAXSIM, the Policy Rules Database — agreement builds trust and divergence isolates where a discrepancy originates: it stops being</w:t>
       </w:r>
       <w:r>
         <w:t xml:space="preserve"> </w:t>
@@ -3120,7 +3108,7 @@
         <w:t xml:space="preserve"> </w:t>
       </w:r>
       <w:r>
-        <w:t xml:space="preserve">and becomes a specific question about a specific rule, sometimes a bug and sometimes a genuine dispute about what the policy means. PolicyEngine’s role in that arrangement was the integrator’s — cross-checking across Python and R, across taxes and benefits, across academic and government implementations of the same law.</w:t>
+        <w:t xml:space="preserve">and becomes a specific question about a specific rule, sometimes a bug and sometimes a genuine dispute about what the policy means. PolicyEngine’s role in that arrangement was the integrator’s: cross-checking across Python and R, across taxes and benefits, across academic and government implementations of the same law.</w:t>
       </w:r>
     </w:p>
     <w:p>
@@ -3148,7 +3136,7 @@
         <w:t xml:space="preserve"> </w:t>
       </w:r>
       <w:r>
-        <w:t xml:space="preserve">Read that carefully, because it is easy to over-read: it measures agreement between two models, not a grade against reality. Two implementations of the same statute should agree, and where they don’t, one of them has a bug or the law has an ambiguity — which is exactly what made the income tax comparison, in the record’s words, less promising: the two systems had trouble even identifying which variables corresponded, with edge cases everywhere housing benefit met legacy benefits or a household crossed into Scottish provisions. Checking a model against a government model turns out to be hard for definitional reasons, not arithmetic ones — two systems can define</w:t>
+        <w:t xml:space="preserve">Read that carefully, because it is easy to over-read: it measures agreement between two models, not a grade against reality. Two implementations of the same statute should agree, and where they don’t, one of them has a bug or the law has an ambiguity. That is exactly what made the income tax comparison, in the record’s words, less promising: the two systems had trouble even identifying which variables corresponded, with edge cases everywhere housing benefit met legacy benefits or a household crossed into Scottish provisions. The hard part of checking a model against a government model is definitional: two systems can define</w:t>
       </w:r>
       <w:r>
         <w:t xml:space="preserve"> </w:t>
@@ -3246,7 +3234,7 @@
         <w:pStyle w:val="BodyText"/>
       </w:pPr>
       <w:r>
-        <w:t xml:space="preserve">The answer runs through federal income tax, state income tax, payroll taxes, the Earned Income Tax Credit, the Child Tax Credit, Supplemental Security Income, SNAP, and a dozen other programs, each with its own definition of income, its own idea of who counts as the household, and its own phase-out schedule, none of them designed to fit together. No one can calculate this in her head. Most accountants would struggle. Yet the answer shapes every financial decision the family makes.</w:t>
+        <w:t xml:space="preserve">The answer runs through federal income tax, state income tax, payroll taxes, the Earned Income Tax Credit, the Child Tax Credit, Supplemental Security Income, SNAP, and a dozen other programs, each with its own definition of income, its own idea of who counts as the household, and its own phase-out schedule, none of them designed to fit together. No one can calculate this in their head. Most accountants would struggle. Yet the answer shapes every financial decision the family makes.</w:t>
       </w:r>
     </w:p>
     <w:p>
@@ -3287,7 +3275,7 @@
         <w:pStyle w:val="BodyText"/>
       </w:pPr>
       <w:r>
-        <w:t xml:space="preserve">Comprehensiveness here is not a feature. It is the point. A family’s SNAP benefit depends on net income after taxes and deductions; its taxes depend on credits tied to the same children who might also generate SSI or a childcare subsidy. Change one input and the effects ripple through programs that have never heard of each other. The only way to capture the ripple is to evaluate every program at once, for the same household — which no single-program calculator, however good, can do.</w:t>
+        <w:t xml:space="preserve">The interactions force that breadth. A family’s SNAP benefit depends on net income after taxes and deductions; its taxes depend on credits tied to the same children who might also generate SSI or a childcare subsidy. Change one input and the effects ripple through programs that have never heard of each other. The only way to capture the ripple is to evaluate every program at once, for the same household — which no single-program calculator, however good, can do.</w:t>
       </w:r>
     </w:p>
     <w:bookmarkEnd w:id="62"/>
@@ -3347,7 +3335,7 @@
         <w:pStyle w:val="BodyText"/>
       </w:pPr>
       <w:r>
-        <w:t xml:space="preserve">The first is a cliff created by a courtesy. Receiving SSI confers categorical eligibility for SNAP — qualify for one and you qualify for the other, regardless of SNAP’s usual income test. As a disabled worker’s earnings rise, SSI tapers gently toward zero; the day it reaches zero, categorical eligibility vanishes, and the household must suddenly pass SNAP’s own income test, which it may fail outright. The gentle slope ends in a drop, positioned exactly where someone is working their way off the program — a trap sprung by the interaction of two rules, each defensible alone.</w:t>
+        <w:t xml:space="preserve">The first is a cliff created by a courtesy. Receiving SSI confers categorical eligibility for SNAP — qualify for one and you qualify for the other, regardless of SNAP’s usual income test. As a disabled worker’s earnings rise, SSI tapers gently toward zero; the day it reaches zero, categorical eligibility vanishes, and the household must suddenly pass SNAP’s own income test, which it may fail outright. The gentle slope ends in a drop, positioned exactly where someone is working their way off the program.</w:t>
       </w:r>
     </w:p>
     <w:p>
@@ -3375,7 +3363,7 @@
         <w:pStyle w:val="BodyText"/>
       </w:pPr>
       <w:r>
-        <w:t xml:space="preserve">The third arrives on a birthday. A family receiving SSI for a disabled child hits a discontinuity when the child turns eighteen: the program stops counting the parents’ income and starts counting the child’s own. The SSI payment itself often rises. But the same birthday can move the child out of pediatric Medicaid provisions, school meals, and childcare subsidies — family-based benefits keyed to age, not need. Nothing about the child’s disability changed overnight. The rules did. For the New York parent from the opening of this chapter, that third case is not a curiosity; it is a date on her calendar, and the calculator can show her the whole discontinuity years before it lands.</w:t>
+        <w:t xml:space="preserve">The third arrives on a birthday. A family receiving SSI for a disabled child hits a discontinuity when the child turns eighteen: the program stops counting the parents’ income and starts counting the child’s own. The SSI payment itself often rises. But the same birthday can move the child out of pediatric Medicaid provisions, school meals, and childcare subsidies — family-based benefits keyed to age, not need. Nothing about the child’s disability changed overnight. The rules did. For the New York parent from the opening of this chapter, that third case is a date on her calendar, and the calculator can show her the whole discontinuity years before it lands.</w:t>
       </w:r>
     </w:p>
     <w:bookmarkEnd w:id="64"/>
@@ -3524,7 +3512,7 @@
         <w:pStyle w:val="BodyText"/>
       </w:pPr>
       <w:r>
-        <w:t xml:space="preserve">The fix is to calibrate the survey to administrative reality — adjust it until its totals match what the tax and benefit agencies actually recorded. PolicyEngine’s milestone on that road was the Enhanced CPS, released in August 2025: five datasets integrated, reported taxes and benefits replaced with computed amounts for internal consistency, income distributions corrected against IRS records, and the survey weights re-solved to match 9,168 administrative totals — cutting deviations from those targets by about 97 percent. Matching the targets you optimized against is fit, not proof — the honest reading of that 97 percent, and the reason the next chapter spends pages on what calibration cannot guarantee.</w:t>
+        <w:t xml:space="preserve">The fix is to calibrate the survey to administrative reality — adjust it until its totals match what the tax and benefit agencies actually recorded. PolicyEngine’s milestone on that road was the Enhanced CPS, released in August 2025: five datasets integrated, reported taxes and benefits replaced with computed amounts for internal consistency, income distributions corrected against IRS records, and the survey weights re-solved to match 9,168 administrative totals — cutting deviations from those targets by about 97 percent. Matching the targets you optimized against is fit, not proof — the honest reading of that 97 percent, and the reason the next chapter pauses on what calibration cannot guarantee.</w:t>
       </w:r>
     </w:p>
     <w:p>
@@ -3550,7 +3538,7 @@
         <w:pStyle w:val="FirstParagraph"/>
       </w:pPr>
       <w:r>
-        <w:t xml:space="preserve">With rules encoded and a population in hand, scoring a reform is two runs of the same engine: simulate every household under current law, simulate again under the reform, and sum the weighted differences in tax revenue and benefit spending. Each of the roughly 100,000 records in the enhanced dataset — more records than the survey it started from — triggers thousands of eligibility checks and bracket calculations, and the whole run finishes in seconds. That speed is bought, not free: building the engine took years; scoring the marginal reform takes hours because the fixed cost is already paid. Compare the traditional pipeline — read the legislation, code it up, run the model, write the memo, clear review — which takes weeks or months, by which time the legislative moment has often passed. Speed changes what analysis is for, and so does form. A think-tank report is an argument about whether to trust the authors. Infrastructure anyone can run moves the argument to whether the model is sound — a fight that can actually be settled, because model quality is testable in ways a report’s credibility is not.</w:t>
+        <w:t xml:space="preserve">With rules encoded and a population in hand, scoring a reform is two runs of the same engine: simulate every household under current law, simulate again under the reform, and sum the weighted differences in tax revenue and benefit spending. Each of the roughly 100,000 records in the enhanced dataset — more records than the survey it started from — triggers thousands of eligibility checks and bracket calculations, and the whole run finishes in seconds. That speed is bought up front: building the engine took years; scoring the marginal reform takes hours because the fixed cost is already paid. Compare the traditional pipeline — read the legislation, code it up, run the model, write the memo, clear review — which takes weeks or months, by which time the legislative moment has often passed. Speed changes what analysis is for, and so does form. A think-tank report is an argument about whether to trust the authors. Infrastructure anyone can run moves the argument to whether the model is sound, and that fight can actually be settled: model quality is testable in ways a report’s credibility is not.</w:t>
       </w:r>
     </w:p>
     <w:p>
@@ -3584,7 +3572,7 @@
         <w:pStyle w:val="FirstParagraph"/>
       </w:pPr>
       <w:r>
-        <w:t xml:space="preserve">Scores need outcome measures, and the most consequential is poverty. PolicyEngine uses the Supplemental Poverty Measure, which — unlike the older official measure — counts taxes and in-kind benefits like SNAP, adjusts for geographic differences in housing costs, and nets out work and medical expenses; for two adults and two children renting, the 2024 SPM threshold is about $39,400. The choice is not cosmetic. A poverty measure that ignores SNAP cannot register a SNAP reform; the SPM can, which is what makes it the right yardstick for a model whose whole subject is taxes and transfers. In a 2023 analysis, PolicyEngine put roughly 9.6 percent of Americans below their threshold, with children poorer than working-age adults and seniors, and women poorer than men ]. Splitting the microdata exposes what a single rate conceals: WIC, a program that looks gender-neutral on its face, lowers overall poverty by about 0.8 percent but child poverty by 2.6 percent, deep poverty by 2.2 percent, and women’s poverty by 0.9 percent against men’s 0.7 — the program lands where the mothers and children are.</w:t>
+        <w:t xml:space="preserve">Scores need outcome measures, and the most consequential is poverty. PolicyEngine uses the Supplemental Poverty Measure, which — unlike the older official measure — counts taxes and in-kind benefits like SNAP, adjusts for geographic differences in housing costs, and nets out work and medical expenses; for two adults and two children renting, the 2024 SPM threshold is about $39,400. The choice of measure decides what the model can see: a poverty measure that ignores SNAP cannot register a SNAP reform; the SPM can, which is what makes it the right yardstick for a model whose whole subject is taxes and transfers. In a 2023 analysis, PolicyEngine put roughly 9.6 percent of Americans below their threshold, with children poorer than working-age adults and seniors, and women poorer than men ]. Splitting the microdata exposes what a single rate conceals: WIC, a program that looks gender-neutral on its face, lowers overall poverty by about 0.8 percent but child poverty by 2.6 percent, deep poverty by 2.2 percent, and women’s poverty by 0.9 percent against men’s 0.7 — the program lands where the mothers and children are.</w:t>
       </w:r>
     </w:p>
     <w:p>
@@ -3668,7 +3656,23 @@
         <w:pStyle w:val="BodyText"/>
       </w:pPr>
       <w:r>
-        <w:t xml:space="preserve">The second episode is British, and it is a diptych. One panel is the September 2022 mini-budget — the same-day analysis chapter 5 recounted. The society view is what gave that analysis its content: beyond the decile table, the engine put the package’s inequality effect in numbers, a 1.2 percent rise in the Gini coefficient and a 2.2 percent rise in the top-1-percent income share. The other panel is the Universal Credit taper cut from the Autumn 2021 Budget: Chancellor Rishi Sunak cut the rate at which UC is withdrawn as earnings rise from 63 to 55 percent and raised the work allowance by £500 — a reform costing about £2.8 billion a year, cutting poverty by around 3.1 percent, with the gains flowing to roughly 12 percent of the population. For a single parent working 25 hours a week at minimum wage, the change meant keeping about £1,000 more a year, while a two-earner couple gained less. Set the taper cut against the pandemic’s £20-a-week UC uplift and the shapes invert: the uplift reached everyone on Universal Credit while the taper cut reached only working recipients, so per pound the uplift cut poverty roughly 40 percent more effectively — while the taper cut did what the uplift could not, dropping the share of workers facing marginal rates above 70 percent from 26 to 9 percent. Similar money, the same program, opposite signatures: one buys poverty reduction, the other buys work incentives, and the society view is what lets a country see the trade before choosing.</w:t>
+        <w:t xml:space="preserve">The second episode is British, and it is a diptych. One panel is the September 2022 mini-budget — the same-day analysis chapter 5 recounted. The society view is what gave that analysis its content: beyond the decile table, the engine put the package’s inequality effect in numbers, a 1.2 percent rise in the Gini coefficient and a 2.2 percent rise in the top-1-percent income share.</w:t>
+      </w:r>
+    </w:p>
+    <w:p>
+      <w:pPr>
+        <w:pStyle w:val="BodyText"/>
+      </w:pPr>
+      <w:r>
+        <w:t xml:space="preserve">The other panel is the Universal Credit taper cut from the Autumn 2021 Budget: Chancellor Rishi Sunak cut the rate at which UC is withdrawn as earnings rise from 63 to 55 percent and raised the work allowance by £500 — a reform costing about £2.8 billion a year, cutting poverty by around 3.1 percent, with the gains flowing to roughly 12 percent of the population. For a single parent working 25 hours a week at minimum wage, the change meant keeping about £1,000 more a year, while a two-earner couple gained less.</w:t>
+      </w:r>
+    </w:p>
+    <w:p>
+      <w:pPr>
+        <w:pStyle w:val="BodyText"/>
+      </w:pPr>
+      <w:r>
+        <w:t xml:space="preserve">Set the taper cut against the pandemic’s £20-a-week UC uplift and the shapes invert: the uplift reached everyone on Universal Credit while the taper cut reached only working recipients, so per pound the uplift cut poverty roughly 40 percent more effectively — while the taper cut did what the uplift could not, dropping the share of workers facing marginal rates above 70 percent from 26 to 9 percent. Similar money, the same program, opposite signatures: one buys poverty reduction, the other buys work incentives, and the society view is what lets a country see the trade before choosing.</w:t>
       </w:r>
     </w:p>
     <w:p>
@@ -3756,7 +3760,7 @@
         <w:pStyle w:val="BodyText"/>
       </w:pPr>
       <w:r>
-        <w:t xml:space="preserve">The interesting question is not whether to encode the rules but how, and the field has produced three answers — three architectures, of rising vintage. They share more than their partisans admit: each separates the logic from the parameter values, and each has to answer for time, because policy is a time series and last April’s threshold is not this April’s. Where they part ways is in who writes the rules, who can read them, and what the encoding is checked against.</w:t>
+        <w:t xml:space="preserve">How to encode the rules is the interesting question, and the field has produced three answers — three architectures, of rising vintage. They share more than their partisans admit: each separates the logic from the parameter values, and each has to answer for time, because policy is a time series and last April’s threshold is not this April’s. Where they part ways is in who writes the rules, who can read them, and what the encoding is checked against.</w:t>
       </w:r>
     </w:p>
     <w:bookmarkEnd w:id="74"/>
@@ -4324,7 +4328,7 @@
         <w:pStyle w:val="BodyText"/>
       </w:pPr>
       <w:r>
-        <w:t xml:space="preserve">A fourth tool sits outside this axis entirely, and it matters for what comes next. TAXSIM — maintained by Daniel Feenberg at the National Bureau of Economic Research since the early 1980s — is neither a spreadsheet nor an open repository. It is a compiled program behind a web interface, and its distinguishing feature is decades of validation against actual IRS return data, which made it the benchmark other tax calculators are measured against. You cannot step through its code. You can trust its answers. Opaque internals, validated outputs: hold that combination in mind.</w:t>
+        <w:t xml:space="preserve">The last of the chapter’s opening four tools sits outside this axis entirely, and it matters for what comes next. TAXSIM — maintained by Daniel Feenberg at the National Bureau of Economic Research since the early 1980s — is neither a spreadsheet nor an open repository. It is a compiled program behind a web interface, and its distinguishing feature is decades of validation against actual IRS return data, which made it the benchmark other tax calculators are measured against. You cannot step through its code. You can trust its answers. Opaque internals, validated outputs: hold that combination in mind.</w:t>
       </w:r>
     </w:p>
     <w:p>
@@ -4418,7 +4422,7 @@
         <w:pStyle w:val="BodyText"/>
       </w:pPr>
       <w:r>
-        <w:t xml:space="preserve">Imputation predicts a missing value from observed ones. The traditional version fits a regression and applies its average relationship, so every $100,000 earner in California receives roughly the same predicted deduction — a tidy fiction. Quantile regression forests instead estimate the whole distribution of plausible values and sample from it, so a high-income California household might draw a deduction anywhere from $15,000 to $50,000. Preserving that spread is not statistical vanity: a reform that caps itemized deductions has winners and losers only if the model’s households actually vary, and mean imputation quietly deletes the variation the reform turns on.</w:t>
+        <w:t xml:space="preserve">Imputation predicts a missing value from observed ones. The traditional version fits a regression and applies its average relationship, so every $100,000 earner in California receives roughly the same predicted deduction — a tidy fiction. Quantile regression forests instead estimate the whole distribution of plausible values and sample from it, so a high-income California household might draw a deduction anywhere from $15,000 to $50,000. That spread does real work: a reform that caps itemized deductions has winners and losers only if the model’s households actually vary, and mean imputation quietly deletes the variation the reform turns on.</w:t>
       </w:r>
     </w:p>
     <w:p>
@@ -4518,7 +4522,7 @@
         <w:pStyle w:val="FirstParagraph"/>
       </w:pPr>
       <w:r>
-        <w:t xml:space="preserve">Everything in this chapter up to the behavioral response is deterministic. Given the rules and a household’s inputs — under a stated reading, where the statute admits more than one — the tax owed and the benefits due are not estimated but computed, exactly, and they can be checked household by household: against the statute, against a reference calculator, against what a caseworker actually determined. There is a fact of the matter, verifiable now, per unit, before the policy ever takes effect. Chapter 6’s standing caveat — estimates, not determinations — marks the domain’s outer wall: past the encoded rules lie documentation, discretion, and local practice, which is administration, not arithmetic.</w:t>
+        <w:t xml:space="preserve">Everything in this chapter up to the behavioral response is deterministic. Given the rules and a household’s inputs — under a stated reading, where the statute admits more than one — the tax owed and the benefits due are computed, exactly, and they can be checked household by household: against the statute, against a reference calculator, against what a caseworker actually determined. There is a fact of the matter, verifiable now, per unit, before the policy ever takes effect. Chapter 6’s standing caveat — estimates, not determinations — marks the domain’s outer wall: past the encoded rules lie documentation, discretion, and local practice, where administration takes over from arithmetic.</w:t>
       </w:r>
     </w:p>
     <w:p>
@@ -4534,15 +4538,15 @@
         <w:pStyle w:val="BodyText"/>
       </w:pPr>
       <w:r>
-        <w:t xml:space="preserve">The three ingredients also supply the questions to ask of any microsimulation model, including every one this book profiles. Are the calculations right — checked against authoritative sources, and legible enough that you can see why they produce a given answer? Does the microdata represent the population, with missing variables filled defensibly and weights calibrated to real totals? What behavioral assumptions are in play — stated or hidden — and how much do the results move when they change? Held together, the trio also explains why building this took years. The rules you want dictate the data you need: model capital gains and you need assets; model childcare subsidies and you need childcare expenses. The data you have bounds the rules you can honestly simulate: without deduction detail, you cannot credibly score a deduction reform. Dynamics reach into both, since a behavioral response changes effective rates and effective rates change the distributional story. Different models are strong in different columns — TAXSIM in rules, validated against decades of returns; Tax-Data in microdata construction; OG-USA in dynamics, with a full model of overlapping generations behind it — and PolicyEngine’s aim was to be strong across all three at once, which is precisely what made it hard. No single tax formula is difficult. What takes sustained engineering is making comprehensive rules work with realistic data while supporting explicit dynamics, all at once, across the whole system.</w:t>
-      </w:r>
-    </w:p>
-    <w:p>
-      <w:pPr>
-        <w:pStyle w:val="BodyText"/>
-      </w:pPr>
-      <w:r>
-        <w:t xml:space="preserve">Now run the chapter backward with the agent question in mind. Rules: an agent can draft them, and gates can check every unit against statute and reference calculators. Data: agents can build the pipeline, and calibration can be checked against administrative totals — with the joint structure still waiting on harder tests. Dynamics: agents can implement the responses, and reality grades them, later, on its own clock. Each ingredient is a layer an agent can build and a machine can check — against a different kind of ground truth, on a different schedule. That decomposition, and what happened when it met a frontier model with a corpus of law, is the story Part III tells.</w:t>
+        <w:t xml:space="preserve">The three ingredients also supply the questions to ask of any microsimulation model, including every one this book profiles: whether the calculations are right, checked against authoritative sources and legible enough that you can see why they produce a given answer; whether the microdata represents the population, with missing variables filled defensibly and weights calibrated to real totals; and what behavioral assumptions are in play, stated or hidden, and how much the results move when they change. Held together, the trio explains why building this took years. The rules you want dictate the data you need: model capital gains and you need assets; model childcare subsidies and you need childcare expenses. The data you have bounds the rules you can honestly simulate: without deduction detail, you cannot credibly score a deduction reform. Dynamics reach into both, since a behavioral response changes effective rates and effective rates change the distributional story. Different models are strong in different columns — TAXSIM in rules, validated against decades of returns; Tax-Data in microdata construction; OG-USA in dynamics, with a full model of overlapping generations behind it — and PolicyEngine’s aim was to be strong across all three at once, which is precisely what made it hard. No single tax formula is difficult. What takes sustained engineering is making comprehensive rules work with realistic data while supporting explicit dynamics, all at once, across the whole system.</w:t>
+      </w:r>
+    </w:p>
+    <w:p>
+      <w:pPr>
+        <w:pStyle w:val="BodyText"/>
+      </w:pPr>
+      <w:r>
+        <w:t xml:space="preserve">Now run the chapter backward with the agent question in mind. Rules: an agent can draft them, and gates can check every unit against statute and reference calculators. Data: agents can build the pipeline, and calibration can be checked against administrative totals — with the joint structure still waiting on harder tests. Dynamics: agents can implement the responses, and reality grades them, later, on its own clock. Each ingredient is a layer an agent can build and a machine can check; no single ground truth serves all three, and the verdicts do not arrive together. That decomposition, and what happened when it met a frontier model with a corpus of law, is the story Part III tells.</w:t>
       </w:r>
     </w:p>
     <w:bookmarkEnd w:id="78"/>
@@ -4620,7 +4624,7 @@
         <w:pStyle w:val="BodyText"/>
       </w:pPr>
       <w:r>
-        <w:t xml:space="preserve">That division of labor was a decision, not a lag. A deterministic engine produces the numbers — encoding the rules exactly, returning identical outputs for identical inputs, auditable to the line of statute — and a language model explains them, never touching the arithmetic, calling the engine instead of consulting its own weights. The arrangement had a second dividend we did not fully appreciate at the time: because every explanation started from the engine’s calculation tree, every explanation was checkable against it. Later in this chapter we would learn, expensively, what happens when an explanation floats free of the tree.</w:t>
+        <w:t xml:space="preserve">We chose that division of labor and meant it to last. A deterministic engine produces the numbers — encoding the rules exactly, returning identical outputs for identical inputs, auditable to the line of statute — and a language model explains them, never touching the arithmetic, calling the engine instead of consulting its own weights. The arrangement had a second dividend we did not fully appreciate at the time: because every explanation started from the engine’s calculation tree, every explanation was checkable against it. Later in this chapter we would learn, expensively, what happens when an explanation floats free of the tree.</w:t>
       </w:r>
     </w:p>
     <w:p>
@@ -4661,7 +4665,7 @@
         <w:pStyle w:val="BodyText"/>
       </w:pPr>
       <w:r>
-        <w:t xml:space="preserve">Two years later, the tax-software company Column Tax raised the stakes from reading to filing. TaxCalcBench, published in July 2025, put frontier models to work on hand-built federal returns for tax year 2024 — synthetic cases with the taxpayer’s complete information supplied, each filing scored line against line. Under strict scoring, the best performer, Google’s Gemini 2.5 Pro, produced a fully correct return 32.35 percent of the time; Anthropic’s Claude Opus 4 managed 27.45 percent. Loosen the standard to within five dollars per line and the best model still cleared only about half. The failures had a signature: instead of looking up the IRS tax tables the law requires, models computed tax from the bracket percentages, landing three to five dollars off on return after return — a mechanism behind 15 to 20 percent of the failures by itself. And note what the test was not. These were bounded, synthetic, federal-only cases, simpler than what a storefront preparer sees in March. The models failed the easy version.</w:t>
+        <w:t xml:space="preserve">Two years later, the tax-software company Column Tax raised the stakes from reading to filing. TaxCalcBench, published in July 2025, put frontier models to work on hand-built federal returns for tax year 2024 — synthetic cases with the taxpayer’s complete information supplied, each filing scored line against line. Under strict scoring, the best performer, Google’s Gemini 2.5 Pro, produced a fully correct return fewer than a third of the time; Anthropic’s Claude Opus 4 managed 27 percent. Loosen the standard to within five dollars per line and the best model still cleared only about half. The failures had a signature: instead of looking up the IRS tax tables the law requires, models computed tax from the bracket percentages, landing three to five dollars off on return after return — a mechanism behind 15 to 20 percent of the failures by itself. And note what the test was not. These were bounded, synthetic, federal-only cases, simpler than what a storefront preparer sees in March. The models failed the easy version.</w:t>
       </w:r>
     </w:p>
     <w:p>
@@ -4677,7 +4681,7 @@
         <w:pStyle w:val="BodyText"/>
       </w:pPr>
       <w:r>
-        <w:t xml:space="preserve">Three benchmarks, three years, one verdict. The obvious rejoinder at every step was that the next model generation would grow out of it, and the dates are the answer: several generations of frontier models came and went between the first test and the last, and the failure survived them all, migrating from reading comprehension to table lookups to program interactions as the tests grew more realistic. Each benchmark measured the same collision from a different angle — a machine trained on the patterns in text meeting a body of rules that is not a pattern. The rules change every January. They differ across fifty states. They turn on interactions among dozens of provisions, and next year’s thresholds appear in no training set, because no one has written them yet. The next chapter takes up why this is permanent; what mattered in 2023 was the practical inference. If frontier models cannot reliably compute a return, they need a tool, not a bigger corpus. AI systems do not memorize multiplication tables; they call calculators. An AI answering a tax question should call a tax engine.</w:t>
+        <w:t xml:space="preserve">Three benchmarks, three years, one verdict. The obvious rejoinder at every step was that the next model generation would grow out of it, and the dates are the answer: several generations of frontier models came and went between the first test and the last, and the failure survived them all, migrating from reading comprehension to table lookups to program interactions as the tests grew more realistic. Each benchmark measured the same collision from a different angle — a machine trained on the patterns in text meeting a body of rules that is not a pattern. The rules change every January. They differ across fifty states. They turn on interactions among dozens of provisions, and next year’s thresholds appear in no training set, because no one has written them yet. The next chapter takes up why this is permanent; what mattered in 2023 was the practical inference. If frontier models cannot reliably compute a return, they need a tool. AI systems do not memorize multiplication tables; they call calculators. An AI answering a tax question should call a tax engine.</w:t>
       </w:r>
     </w:p>
     <w:bookmarkEnd w:id="81"/>
@@ -4727,7 +4731,7 @@
         <w:pStyle w:val="BodyText"/>
       </w:pPr>
       <w:r>
-        <w:t xml:space="preserve">Tool quality turns out to be several properties, each its own work. Accuracy. Comprehensiveness — a tool covering federal tax and three benefit programs returns the wrong household total the moment a fourth program is in play. Currency — when Congress rewrote the Child Tax Credit in July 2025, every tool answering family tax questions was wrong until someone updated it, and currency is that race, run each time a legislature meets. Legibility to the developer, the auditor, the caseworker downstream. None of these yields to more training. Each has to be built, and kept built, inside the tool.</w:t>
+        <w:t xml:space="preserve">Tool quality turns out to be several properties, each its own work. Accuracy. Comprehensiveness — a tool covering federal tax and three benefit programs returns the wrong household total the moment a fourth program is in play. Currency — when Congress rewrote the Child Tax Credit in July 2025, a tool answering family tax questions was wrong until someone updated it, and currency is that race, run each time a legislature meets. Legibility to the developer, the auditor, the caseworker downstream. None of these yields to more training. Each has to be built, and kept built, inside the tool.</w:t>
       </w:r>
     </w:p>
     <w:bookmarkEnd w:id="82"/>
@@ -4761,15 +4765,15 @@
         <w:pStyle w:val="BodyText"/>
       </w:pPr>
       <w:r>
-        <w:t xml:space="preserve">Day to day, what the interface adds is reach, with a seam. When we tested letting several specialized agents coordinate on a research task, they handled the standard distributional runs and stumbled where programs interacted — implementing each correctly in isolation, then missing how a benefit taper in one collides with a phase-out in another. The mechanical translation transfers; the coordination logic, so far, does not, and the seam where programs interact is where a human analyst still stands. This is augmentation, not automation, and the distinction is measured rather than asserted.</w:t>
-      </w:r>
-    </w:p>
-    <w:p>
-      <w:pPr>
-        <w:pStyle w:val="BodyText"/>
-      </w:pPr>
-      <w:r>
-        <w:t xml:space="preserve">The reach cuts both ways, and it is worth saying so plainly. A congressional staffer who knows policy but not programming, an advocacy group with no data team, can now run analyses that used to require an economist — and so can anyone hunting for a cherry-picked scenario or a confident misreading. Those risks existed under the old system too, concentrated among the few who could run the models. Broader access invites broader checking, and the checking is the part that scales best: show a worker that she faces a 67 percent marginal tax rate, and the engine hands over the pieces — federal tax, payroll tax, an EITC phasing out, a partial credit clawback — for the model to assemble into the one plain sentence explaining why an extra dollar of her earnings mostly vanishes. The old system could compute that rate too. It could not put the explanation in front of the person living it.</w:t>
+        <w:t xml:space="preserve">Day to day, what the interface adds is reach, with a seam. When we tested letting several specialized agents coordinate on a research task, they handled the standard distributional runs and stumbled where programs interacted — implementing each correctly in isolation, then missing how a benefit taper in one collides with a phase-out in another. The mechanical translation transfers; the coordination logic, so far, does not, and the seam where programs interact is where a human analyst still stands. The line between augmentation and automation runs through that seam, measured rather than asserted.</w:t>
+      </w:r>
+    </w:p>
+    <w:p>
+      <w:pPr>
+        <w:pStyle w:val="BodyText"/>
+      </w:pPr>
+      <w:r>
+        <w:t xml:space="preserve">The reach cuts both ways. A congressional staffer who knows policy but not programming, an advocacy group with no data team, can now run analyses that used to require an economist — and so can anyone hunting for a cherry-picked scenario or a confident misreading. Those risks existed under the old system too, concentrated among the few who could run the models. Broader access invites broader checking, and the explanation is the part that scales best: show a worker that she faces a 67 percent marginal tax rate, and the engine hands over the pieces — federal tax, payroll tax, an EITC phasing out, a partial credit clawback — for the model to assemble into the one plain sentence explaining why an extra dollar of her earnings mostly vanishes. The old system could compute that rate too. It could not put the explanation in front of the person living it.</w:t>
       </w:r>
     </w:p>
     <w:bookmarkEnd w:id="83"/>
@@ -4922,7 +4926,7 @@
         <w:pStyle w:val="FirstParagraph"/>
       </w:pPr>
       <w:r>
-        <w:t xml:space="preserve">It is not that no one sells tax software. Specialists thrive on every slice. April embeds tax filing inside other companies’ apps; Column Tax has filed more than a million returns through its API and built an AI agent to help maintain its engine as the law shifts year to year. Avalara computes sales tax, and was acquired for $8.4 billion in 2022. ADP and Gusto run payroll. MyFriendBen and Benefit Kitchen screen for benefits. PolicyEngine, EUROMOD, and Tax-Calculator serve policy research. The global tax-technology market was climbing toward $60 billion — balkanized into verticals, each re-encoding the same overlapping rules behind its own walls.</w:t>
+        <w:t xml:space="preserve">Plenty of companies sell tax software. Specialists thrive on every slice. April embeds tax filing inside other companies’ apps; Column Tax has filed more than a million returns through its API and built an AI agent to help maintain its engine as the law shifts year to year. Avalara computes sales tax, and was acquired for $8.4 billion in 2022. ADP and Gusto run payroll. MyFriendBen and Benefit Kitchen screen for benefits. PolicyEngine, EUROMOD, and Tax-Calculator serve policy research. The global tax-technology market was climbing toward $60 billion — balkanized into verticals, each re-encoding the same overlapping rules behind its own walls.</w:t>
       </w:r>
     </w:p>
     <w:p>
@@ -4959,7 +4963,7 @@
         <w:t xml:space="preserve">on their own because tax calculations require 100% correctness”</w:t>
       </w:r>
       <w:r>
-        <w:t xml:space="preserve">. On our benchmark, the best 2026 models still got roughly one in nine household calculations wrong by more than a dollar. The answer was never a better prompt. The answer is a deterministic, auditable engine the model calls — the tool chapter 8 specified and this chapter builds.</w:t>
+        <w:t xml:space="preserve">. On our benchmark, the best 2026 models still got roughly one in nine household calculations wrong by more than a dollar. The way through is the tool chapter 8 specified: a deterministic, auditable engine the model calls, and this chapter builds it.</w:t>
       </w:r>
     </w:p>
     <w:bookmarkEnd w:id="87"/>
@@ -4977,7 +4981,7 @@
         <w:pStyle w:val="FirstParagraph"/>
       </w:pPr>
       <w:r>
-        <w:t xml:space="preserve">Before the building, a correction to what</w:t>
+        <w:t xml:space="preserve">Before the building comes a correction, learned the hard way, to what</w:t>
       </w:r>
       <w:r>
         <w:t xml:space="preserve"> </w:t>
@@ -4989,7 +4993,7 @@
         <w:t xml:space="preserve"> </w:t>
       </w:r>
       <w:r>
-        <w:t xml:space="preserve">means here, learned the hard way. The hardest problems in benefits software are not mathematical. Whether a formula is legally correct is one question; how fast a rule change becomes publishable, how many misunderstanding loops open between the policy expert and the engineer, how much hand-holding a partner developer needs, and how often a tool hands back a misleading answer because its interface cannot express a real-world exception — these decide whether the software is any good, and none of them is a math problem. They surface as operational metrics: time to publish, discrepancy rates against authoritative examples, onboarding time, the rate at which a support ticket exposes an unwritten assumption.</w:t>
+        <w:t xml:space="preserve">means here. The hardest problems in benefits software are not mathematical. Whether a formula is legally correct is one question; how fast a rule change becomes publishable, how many misunderstanding loops open between the policy expert and the engineer, how much hand-holding a partner developer needs, and how often a tool hands back a misleading answer because its interface cannot express a real-world exception — these decide whether the software is any good, and none of them is a math problem. They surface as operational metrics: time to publish, discrepancy rates against authoritative examples, onboarding time, the rate at which a support ticket exposes an unwritten assumption.</w:t>
       </w:r>
     </w:p>
     <w:p>
@@ -5066,7 +5070,7 @@
         <w:t xml:space="preserve">“bots are considered non-merit staff and prohibited from performing these merit staff functions”</w:t>
       </w:r>
       <w:r>
-        <w:t xml:space="preserve">. That boundary matches the architecture this book has been arguing for from the other direction: decision support, never decision replacement. A human makes the determination. The tool’s job is to make the determination checkable — and everything in the failures above, from Robodebt to the Kentucky renewal logic, is a case where the determination was neither human nor checkable.</w:t>
+        <w:t xml:space="preserve">. That boundary matches the architecture this book has been arguing for from the other direction. A human makes the determination. The tool’s job is to make the determination checkable — and everything in the failures above, from Robodebt to the Kentucky renewal logic, is a case where the determination was neither human nor checkable.</w:t>
       </w:r>
     </w:p>
     <w:bookmarkEnd w:id="89"/>
@@ -5154,7 +5158,7 @@
         <w:pStyle w:val="FirstParagraph"/>
       </w:pPr>
       <w:r>
-        <w:t xml:space="preserve">Encoding law by hand is slow and does not scale; a team can keep one country current or attempt fifty, not both. The pipeline, axiom-encode, turns encoding from analyst-months into agent-runs. It pulls the relevant provisions from the corpus, scaffolds a prompt around them — the statute text, the concepts it touches, the shape of the encoding to produce — and hands the draft to a language model. Then, before anything merges, the draft runs a gauntlet in which every gate can block the merge: the code must compile; its tests must pass; a proof step must validate the logic’s internal consistency; the output must be compared against independent reference calculators; and every monetary obligation must be grounded in its source. Only a draft that clears all of it yields a signed manifest — a cryptographic record of what was encoded, from which sources, having passed which checks — so a later reviewer, a skeptical agency, or a court can reconstruct the provenance rather than take it on faith. Human review sits deliberately at the top of this stack, not the bottom: the machine drafts and the gates screen, while a person adjudicates the judgment calls the statute leaves genuinely open — the cross-references and exceptions no gate can settle.</w:t>
+        <w:t xml:space="preserve">Encoding law by hand is slow and does not scale; a team can keep one country current or attempt fifty, not both. The pipeline, axiom-encode, turns encoding from analyst-months into agent-runs. It pulls the relevant provisions from the corpus, scaffolds a prompt around them — the statute text, the concepts it touches, the shape of the encoding to produce — and hands the draft to a language model. Then, before anything merges, the draft runs a gauntlet in which every gate can block the merge: the code must compile; its tests must pass; a proof step must validate the logic’s internal consistency; the output must be compared against independent reference calculators; and every monetary obligation must be grounded in its source. Only a draft that clears all of it yields a signed manifest — a cryptographic record of what was encoded, from which sources, having passed which checks — so a later reviewer, a skeptical agency, or a court can reconstruct the provenance rather than take it on faith. Human review sits deliberately at the top of this stack: the machine drafts and the gates screen, while a person adjudicates the judgment calls the statute leaves genuinely open — the cross-references and exceptions no gate can settle.</w:t>
       </w:r>
     </w:p>
     <w:p>
@@ -5186,7 +5190,7 @@
         <w:pStyle w:val="BodyText"/>
       </w:pPr>
       <w:r>
-        <w:t xml:space="preserve">Notice, finally, what the gauntlet does not trust: the model that wrote the draft. The pipeline runs several language-model backends and stays indifferent to which produced a given encoding, because the guarantee lives in the gates, not the generator. A better model drafts faster and trips fewer checks. It never earns the right to skip them.</w:t>
+        <w:t xml:space="preserve">Notice, finally, what the gauntlet does not trust: the model that wrote the draft. The pipeline runs several language-model backends and stays indifferent to which produced a given encoding: wherever the draft comes from, the gates hold the guarantee. A better model drafts faster and trips fewer checks. It never earns the right to skip them.</w:t>
       </w:r>
     </w:p>
     <w:bookmarkEnd w:id="92"/>
@@ -5240,31 +5244,7 @@
         <w:pStyle w:val="BodyText"/>
       </w:pPr>
       <w:r>
-        <w:t xml:space="preserve">Whether a provision is hard law or soft guidance is recorded as a property of the encoding — never used to decide whether it is worth encoding. And the encodings model authority explicitly: the chain by which a statute delegates power to an agency, and an agency binds itself through its own published policy. The doctrines are old — in US law an agency must follow its own regulations; in English law it must follow its own stated policy absent good reason — and encoding them lets a system answer not only what a rule computes but whether the body applying it had the authority to. That matters because much of law is not</w:t>
-      </w:r>
-      <w:r>
-        <w:t xml:space="preserve"> </w:t>
-      </w:r>
-      <w:r>
-        <w:t xml:space="preserve">“compute an amount”</w:t>
-      </w:r>
-      <w:r>
-        <w:t xml:space="preserve"> </w:t>
-      </w:r>
-      <w:r>
-        <w:t xml:space="preserve">at all. It is</w:t>
-      </w:r>
-      <w:r>
-        <w:t xml:space="preserve"> </w:t>
-      </w:r>
-      <w:r>
-        <w:t xml:space="preserve">“does this conclusion hold, fail, or remain undetermined, given a history of events?”</w:t>
-      </w:r>
-      <w:r>
-        <w:t xml:space="preserve"> </w:t>
-      </w:r>
-      <w:r>
-        <w:t xml:space="preserve">— whether a notice is valid, a deadline met, a procedure followed. Modeling authority, delegation, and that second shape of question is the difference between encoding a calculator and encoding the law. Everything ships under permissive licenses — Apache 2.0 for the code, Creative Commons Attribution for the content — so no one need ask permission to run, fork, or build on the encoded law.</w:t>
+        <w:t xml:space="preserve">Whether a provision is hard law or soft guidance is recorded as a property of the encoding; it plays no part in deciding what is worth encoding. And the encodings model authority explicitly: the chain by which a statute delegates power to an agency, and an agency binds itself through its own published policy. The doctrines are old — in US law an agency must follow its own regulations; in English law it must follow its own stated policy absent good reason — and encoding them lets a system answer not only what a rule computes but whether the body applying it had the authority to. That matters because much of law computes no amount at all; it asks whether a conclusion holds, fails, or remains undetermined, given a history of events: is the notice valid, the deadline met, the procedure followed? Modeling authority, delegation, and that second shape of question is the difference between encoding a calculator and encoding the law. Everything ships under permissive licenses — Apache 2.0 for the code, Creative Commons Attribution for the content — so no one need ask permission to run, fork, or build on the encoded law.</w:t>
       </w:r>
     </w:p>
     <w:bookmarkEnd w:id="93"/>
@@ -5348,7 +5328,7 @@
         <w:pStyle w:val="BodyText"/>
       </w:pPr>
       <w:r>
-        <w:t xml:space="preserve">It failed. Regeneration was genuinely cheap — about eight cents of compute per module — but in twenty-three of the twenty-five cases the original encoding was the correct one, and the freshly regenerated version introduced naming instability that would have silently broken every downstream consumer. Same source, same pipeline, different output. We adopted the conclusion the evidence forced, against the elegant version of our own story: encodings are not disposable cache. They are durable artifacts with provenance — stored, versioned, migrated with care — and regeneration went back on the shelf as a research problem. I count the episode as the discipline working. A project convinced of its own story would have shipped regeneration and met the breakage in production.</w:t>
+        <w:t xml:space="preserve">It failed. Regeneration was genuinely cheap — about eight cents of compute per module — but in twenty-three of the twenty-five cases the original encoding was the correct one, and the freshly regenerated version introduced naming instability that would have silently broken every downstream consumer. Same source, same pipeline, different output. We adopted the conclusion the evidence forced, against the elegant version of our own story: an encoding is a durable artifact with provenance — stored, versioned, migrated with care — and regeneration went back on the shelf as a research problem. I count the episode as the discipline working. A project convinced of its own story would have shipped regeneration and met the breakage in production.</w:t>
       </w:r>
     </w:p>
     <w:p>
@@ -5571,7 +5551,7 @@
         <w:t xml:space="preserve"> </w:t>
       </w:r>
       <w:r>
-        <w:t xml:space="preserve">on these boards, does not mean nothing disagreed. It means everything that disagreed was run to ground and written down.</w:t>
+        <w:t xml:space="preserve">on these boards, means everything that disagreed was run to ground and written down.</w:t>
       </w:r>
     </w:p>
     <w:bookmarkEnd w:id="98"/>
@@ -5597,15 +5577,15 @@
         <w:pStyle w:val="BodyText"/>
       </w:pPr>
       <w:r>
-        <w:t xml:space="preserve">What makes that possible is exhaustiveness, not cleverness. Nobody maintaining a mature model by hand replays tens of thousands of records against a second independent engine on every change; until recently the compute and the tooling made it prohibitive. When you do, an inconsistency that surfaces in a handful of unusual cases stops hiding in the tail. It becomes a specific record with a specific wrong number that a person can investigate.</w:t>
-      </w:r>
-    </w:p>
-    <w:p>
-      <w:pPr>
-        <w:pStyle w:val="BodyText"/>
-      </w:pPr>
-      <w:r>
-        <w:t xml:space="preserve">Chasing one mismatch through the UK savings rules, we found the discrepancy was not in our encoding. UKMOD was mishandling an interaction involving the personal savings allowance — a corner where two provisions meet and the combined behavior is easy to get subtly wrong. We wrote it up the way the discipline demands — the inputs, the statutory result expected and why, the reference model’s actual output, the provision each system implemented — and filed it publicly as an issue on the UKMOD-PUBLIC repository for its maintainers to weigh. A second case was stranger. Running the EUROMOD comparison, identical input cases sometimes scored differently depending on where they sat in a batch — the same household, the same year, two answers, determined by the case’s neighbors in the queue rather than by anything about the case. That is the fingerprint of state leaking between records that are supposed to be independent. We root-caused it to a batch-processing contamination bug in the adapter layer that runs cases through the model, and reported it to the maintainers with a reproduction in hand.</w:t>
+        <w:t xml:space="preserve">Exhaustiveness makes that possible. Nobody maintaining a mature model by hand replays tens of thousands of records against a second independent engine on every change; until recently the compute and the tooling made it prohibitive. When you do, an inconsistency that surfaces in a handful of unusual cases stops hiding in the tail. It becomes a specific record with a specific wrong number that a person can investigate.</w:t>
+      </w:r>
+    </w:p>
+    <w:p>
+      <w:pPr>
+        <w:pStyle w:val="BodyText"/>
+      </w:pPr>
+      <w:r>
+        <w:t xml:space="preserve">Chasing one mismatch through the UK savings rules, we found the discrepancy was not in our encoding. UKMOD was mishandling an interaction involving the personal savings allowance, a corner where two provisions meet and the combined behavior is easy to get subtly wrong. We wrote it up the way the discipline demands — the inputs, the statutory result expected and why, the reference model’s actual output, the provision each system implemented — and filed it publicly as an issue on the UKMOD-PUBLIC repository for its maintainers to weigh. A second case was stranger. Running the EUROMOD comparison, identical input cases sometimes scored differently depending on where they sat in a batch — the same household, the same year, two answers, determined by the case’s neighbors in the queue rather than by anything about the case. That is the fingerprint of state leaking between records that are supposed to be independent. We root-caused it to a batch-processing contamination bug in the adapter layer that runs cases through the model, and reported it to the maintainers with a reproduction in hand.</w:t>
       </w:r>
     </w:p>
     <w:p>
@@ -5625,7 +5605,7 @@
         <w:t xml:space="preserve"> </w:t>
       </w:r>
       <w:r>
-        <w:t xml:space="preserve">is exactly the epistemic position this project exists to escape. TAXSIM has run for forty years. EUROMOD and its national variants represent decades of institutional work. That a model of that size contains a bug is not a scandal — every large model does, our encodings emphatically included — and finding one is not a victory over its authors. It is collaboration running in both directions: the reference model gets free, specific, evidence-backed quality assurance from a system precise enough to notice a three-cent gap and disciplined enough to chase it to cause. Openness means the errors flow both ways, bugs filed upstream and downstream, both models better for it.</w:t>
+        <w:t xml:space="preserve">is exactly the epistemic position this project exists to escape. TAXSIM has run for forty years. EUROMOD and its national variants represent decades of institutional work. That a model of that size contains a bug is not a scandal — every large model does, our encodings emphatically included — and finding one is no victory over its authors. The collaboration runs in both directions: the reference model gets free, specific, evidence-backed quality assurance from a system precise enough to notice a three-cent gap and disciplined enough to chase it to cause. Openness means the errors flow both ways, bugs filed upstream and downstream, both models better for it.</w:t>
       </w:r>
     </w:p>
     <w:bookmarkEnd w:id="99"/>
@@ -5643,7 +5623,7 @@
         <w:pStyle w:val="FirstParagraph"/>
       </w:pPr>
       <w:r>
-        <w:t xml:space="preserve">The hardest honest objection to a public rules layer is not that it will be wrong on launch day. It is that it will rot. Laws change every year, and the characteristic failure of shared infrastructure is quiet staleness — encodings drifting out of date, coverage eroding at the edges, a model accurate on the day it shipped and subtly wrong three budgets later with no one the wiser. A verification suite that runs once and gets admired is no defense. A suite wired into a ratchet is.</w:t>
+        <w:t xml:space="preserve">The hardest honest objection to a public rules layer is rot. Laws change every year, and the characteristic failure of shared infrastructure is quiet staleness — encodings drifting out of date, coverage eroding at the edges, a model accurate on the day it shipped and subtly wrong three budgets later with no one the wiser. A verification suite that runs once and gets admired is no defense. A suite wired into a ratchet is.</w:t>
       </w:r>
     </w:p>
     <w:p>
@@ -5703,7 +5683,7 @@
         <w:pStyle w:val="BodyText"/>
       </w:pPr>
       <w:r>
-        <w:t xml:space="preserve">The B1 probe from chapter 9 is the cleanest example, and it is worth restating as a verification story rather than an engineering one. We took twenty-five modules in production, regenerated each fresh from its source, and compared the output against the version we were running — regeneration cost about eight cents of compute per module, and twenty-three of the twenty-five came back with the old version correct and the regenerated one worse, mostly through renamed variables that would have silently broken every downstream consumer. We know that not because anyone reasoned their way to it in advance but because a gate compared regenerated output to a known-good baseline and the baseline won, 23 to 2. The deeper lesson outlived the experiment: an encoding is an answer with a history — which source, which version of the law, which call was made where the text was genuinely ambiguous — and regenerating from scratch discards the history while producing an artifact that looks every bit as authoritative. Durability is what lets a consumer trust that yesterday’s number still means the same thing today, and that when it changes, it changed because the law did.</w:t>
+        <w:t xml:space="preserve">The B1 probe from chapter 9 is the cleanest example, and it is worth restating as a verification story rather than an engineering one. We took twenty-five modules in production, regenerated each fresh from its source, and compared the output against the version we were running — regeneration cost about eight cents of compute per module, and twenty-three of the twenty-five came back with the old version correct and the regenerated one worse, mostly through renamed variables that would have silently broken every downstream consumer. Nobody reasoned their way to that in advance; we know it because a gate compared regenerated output to a known-good baseline, and the baseline won, 23 to 2. The deeper lesson outlived the experiment: an encoding is an answer with a history — which source, which version of the law, which call was made where the text was genuinely ambiguous — and regenerating from scratch discards the history while producing an artifact that looks every bit as authoritative. Durability is what lets a consumer trust that yesterday’s number still means the same thing today, and that when it changes, it changed because the law did.</w:t>
       </w:r>
     </w:p>
     <w:p>
@@ -5757,7 +5737,7 @@
         <w:pStyle w:val="FirstParagraph"/>
       </w:pPr>
       <w:r>
-        <w:t xml:space="preserve">Underneath everything in this chapter — the per-worker races, the dispositions, the ratchets, the gates that embarrass their builders — sits a single rule, and since the rest of the book enforces it, it should be stated plainly. Simulation is admissible only where its verification chain terminates in ground truth—a forecast score, an oracle parity, a statutory exactness, a calibrated marginal.</w:t>
+        <w:t xml:space="preserve">One rule sits under everything in this chapter, and the rest of the book enforces it. Simulation is admissible only where its verification chain terminates in ground truth — a forecast score, an oracle parity, a statutory exactness, a calibrated marginal.</w:t>
       </w:r>
     </w:p>
     <w:p>
@@ -5816,7 +5796,7 @@
         <w:pStyle w:val="BodyText"/>
       </w:pPr>
       <w:r>
-        <w:t xml:space="preserve">What each country gained from the week was not its first model. It was a second, independent implementation of its statutes — permissively licensed, open to anyone for any purpose, built from the gazetted law itself — plus the thing I have come to think matters more: a public ledger recording every place the two implementations disagree and why. What the reference models’ maintainers gained runs the other way, and I will get to it. Everything here, as in the last chapter, is our own program reporting on itself; the ledgers are public and the comparisons are built to be rerun.</w:t>
+        <w:t xml:space="preserve">Each country already had a model. What the week added was a second, independent implementation of its statutes — permissively licensed, open to anyone for any purpose, built from the gazetted law itself — plus the thing I have come to think matters more: a public ledger recording every place the two implementations disagree and why. What the reference models’ maintainers gained runs the other way, and I will get to it. Everything here, as in the last chapter, is our own program reporting on itself; the ledgers are public and the comparisons are built to be rerun.</w:t>
       </w:r>
     </w:p>
     <w:p>
@@ -5849,7 +5829,7 @@
         <w:pStyle w:val="BodyText"/>
       </w:pPr>
       <w:r>
-        <w:t xml:space="preserve">A finding is not a bug report, and it is not a failure notice. It is a dispositioned divergence: a specific case where the encoded statute and the reference model produce different numbers, chased until someone can say why, and recorded together with the evidence for the explanation.</w:t>
+        <w:t xml:space="preserve">A finding, in these ledgers, is a dispositioned divergence: a specific case where the encoded statute and the reference model produce different numbers, chased until someone can say why, and recorded together with the evidence for the explanation.</w:t>
       </w:r>
       <w:r>
         <w:t xml:space="preserve"> </w:t>
@@ -5869,7 +5849,7 @@
         <w:pStyle w:val="BodyText"/>
       </w:pPr>
       <w:r>
-        <w:t xml:space="preserve">The explanation can land on either side. Sometimes the encoding is wrong — a misread threshold, a missing phase-out, a rate applied to the wrong base — and the fix goes into the encoding. Sometimes the reference model is out of date, or has made a defensible modeling choice the statute does not require, and the finding travels upstream: written up with its arithmetic and its citation and reported to UNU-WIDER, whose team maintains the SOUTHMOD models. Ghana’s thirteen findings are thirteen such adjudications, posted where anyone can read them. The reference models are instruments, not adversaries, and like any instrument they are improved by being read carefully against their source. There is a quiet reversal of trust inside that sentence. The natural assumption is that the established, decade-old model is the authority and the freshly generated encoding is on trial — and most of the time that is right, and most findings are the encoding’s to fix. But not all. When a divergence is chased to ground and the statute plainly says one thing while a model does another, the encoding becomes the instrument that caught it. Neither implementation is presumed correct. The statute is, and both are measured against it. Nobody grades anybody, and everybody grades the law.</w:t>
+        <w:t xml:space="preserve">The explanation can land on either side. Sometimes the encoding is wrong — a misread threshold, a missing phase-out, a rate applied to the wrong base — and the fix goes into the encoding. Sometimes the reference model is out of date, or has made a defensible modeling choice the statute does not require, and the finding travels upstream: written up with its arithmetic and its citation and reported to UNU-WIDER, whose team maintains the SOUTHMOD models. Ghana’s thirteen findings are thirteen such adjudications, posted where anyone can read them. The reference models are instruments, and like any instrument they are improved by being read carefully against their source. There is a quiet reversal of trust inside that sentence. The natural assumption is that the established, decade-old model is the authority and the freshly generated encoding is on trial — and most of the time that is right, and most findings are the encoding’s to fix. But not all. When a divergence is chased to ground and the statute plainly says one thing while a model does another, the encoding becomes the instrument that caught it. Neither implementation is presumed correct. The statute is, and both are measured against it. Nobody grades anybody, and everybody grades the law.</w:t>
       </w:r>
     </w:p>
     <w:p>
@@ -5889,7 +5869,7 @@
         <w:t xml:space="preserve"> </w:t>
       </w:r>
       <w:r>
-        <w:t xml:space="preserve">and the widest disagreement anywhere in the suite was four-tenths of one Ugandan shilling per year, rounding, beneath any threshold at which a difference becomes a finding. I checked the arithmetic myself that evening, looking for the catch. There wasn’t one. The catch was in my assumptions about how long careful work takes.</w:t>
+        <w:t xml:space="preserve">and the widest disagreement anywhere in the suite was four-tenths of one Ugandan shilling per year, itself examined and dispositioned as rounding: dust rather than a tolerance band. I checked the arithmetic myself that evening, looking for the catch. There wasn’t one. The catch was in my assumptions about how long careful work takes.</w:t>
       </w:r>
     </w:p>
     <w:p>
@@ -5973,7 +5953,7 @@
         <w:pStyle w:val="BodyText"/>
       </w:pPr>
       <w:r>
-        <w:t xml:space="preserve">The cost of a country, run this way, is measured in days of agent time. For the entire prior history of the field it was measured in years of institutional effort. But the speed is not the achievement, and this is the point the whole week was designed to make: a model that costs days and that no one can check is not an advance over a model that costs years — it is only a faster way to be confidently wrong. What traveled from Ghana to Uganda to Zambia was not encoding speed. It was the discipline bolted to the speed: the gazette manifests, the merge gates, the oracle suites, the public ledger of everything that did not match. The verification shipped in the same box as the model.</w:t>
+        <w:t xml:space="preserve">The cost of a country, run this way, is measured in days of agent time. For the entire prior history of the field it was measured in years of institutional effort. But the whole week was designed to make a point that cuts against celebrating the speed: a model that costs days and that no one can check is only a faster way to be confidently wrong. What traveled from Ghana to Uganda to Zambia was the discipline bolted to the speed: the gazette manifests, the merge gates, the oracle suites, the public ledger of everything that did not match. The verification shipped in the same box as the model.</w:t>
       </w:r>
     </w:p>
     <w:bookmarkEnd w:id="106"/>
@@ -5991,15 +5971,15 @@
         <w:pStyle w:val="FirstParagraph"/>
       </w:pPr>
       <w:r>
-        <w:t xml:space="preserve">Chapter 2 called it the analytical moat: government modelers work from confidential tax microdata with detail no public-use file carries, and outside analysts make do with files that are sampled, top-coded, and blurred. That was told as an American story, with an American statute as its cause. But the moat was never only American, and in most of the world it is not really a moat at all. It is a vacuum — not a gap between the government’s model and a challenger’s, but the absence of any public, inspectable model on either side. A citizen of most countries cannot check what a tax change would do to a household like theirs, because no one outside a ministry has built the tool, and often no one inside one has published it. The asymmetry Washington lives with — half a dozen institutions arguing over a tax bill within days of its introduction — is, across most of the map, closer to silence.</w:t>
-      </w:r>
-    </w:p>
-    <w:p>
-      <w:pPr>
-        <w:pStyle w:val="BodyText"/>
-      </w:pPr>
-      <w:r>
-        <w:t xml:space="preserve">Consider what a public model changes around a single decision. A finance ministry proposes to broaden a VAT, or to replace a fuel subsidy with a cash grant. The question everyone cares about — who gains, who loses, by how much, across the income distribution — lives inside a model. Where the model is the ministry’s alone, the answer arrives as an assertion, and the opposition, the press, civil society, and the affected household can only accept it or reject it whole. Where the model is public and checkable, the same people can run the reform themselves, disagree about assumptions in the open, and be caught when they are wrong. The point is not to take the tool away from the ministry. It is to end the ministry’s monopoly on being able to answer at all.</w:t>
+        <w:t xml:space="preserve">Chapter 2 called it the analytical moat: government modelers work from confidential tax microdata with detail no public-use file carries, and outside analysts make do with files that are sampled, top-coded, and blurred. That was told as an American story, with an American statute as its cause. But the moat was never only American, and in most of the world the better word is vacuum: no gap between the government’s model and a challenger’s, because no public, inspectable model exists on either side. A citizen of most countries cannot check what a tax change would do to a household like theirs, because no one outside a ministry has built the tool, and often no one inside one has published it. The asymmetry Washington lives with — half a dozen institutions arguing over a tax bill within days of its introduction — is, across most of the map, closer to silence.</w:t>
+      </w:r>
+    </w:p>
+    <w:p>
+      <w:pPr>
+        <w:pStyle w:val="BodyText"/>
+      </w:pPr>
+      <w:r>
+        <w:t xml:space="preserve">Consider what a public model changes around a single decision. A finance ministry proposes to broaden a VAT, or to replace a fuel subsidy with a cash grant. The question everyone cares about — who gains, who loses, by how much, across the income distribution — lives inside a model. Where the model is the ministry’s alone, the answer arrives as an assertion, and the opposition, the press, civil society, and the affected household can only accept it or reject it whole. Where the model is public and checkable, the same people can run the reform themselves, disagree about assumptions in the open, and be caught when they are wrong. The ministry keeps its tool. What ends is its monopoly on being able to answer at all.</w:t>
       </w:r>
     </w:p>
     <w:p>
@@ -6033,7 +6013,7 @@
         <w:pStyle w:val="BodyText"/>
       </w:pPr>
       <w:r>
-        <w:t xml:space="preserve">So the summer’s second experiment asked a harder question: take the calibrated synthetic population our data layer builds for the United States — populace, the commons Part II introduced — adapt it to a country it was never built for, and grade it honestly against that country’s real data. The United Kingdom was the natural test case, because it has both an open reference model and a high-quality household survey to grade against. The adapted population ran through a pre-registered evaluation harness — scoring rules fixed and published before any answers were known — and was scored against held-out ground truth from Britain’s Family Resources Survey.</w:t>
+        <w:t xml:space="preserve">So the summer’s second experiment asked a harder question: take the calibrated synthetic population our data layer builds for the United States — populace, the commons Part II introduced — adapt it to a country it was never built for, and grade it honestly against that country’s real data. The United Kingdom was the natural test case, because it has both an open reference model and a high-quality household survey to grade against. The adapted population ran through a pre-registered evaluation harness — scoring rules fixed and published before any answers were known — and was scored against held-out survey ground truth from Britain’s Family Resources Survey.</w:t>
       </w:r>
     </w:p>
     <w:p>
@@ -6061,7 +6041,7 @@
         <w:pStyle w:val="BodyText"/>
       </w:pPr>
       <w:r>
-        <w:t xml:space="preserve">Where both halves can be built, they close tightly. In Belgium, the same machinery was calibrated to twenty-one administrative targets and hit all twenty-one within 1.8 percent; on that same population, per-record social-security contributions agreed with EUROMOD to within three eurocents per person per year. Not a promise that the model is right — a small, checkable number stating exactly how close it came.</w:t>
+        <w:t xml:space="preserve">Where both halves can be built, they close tightly. In Belgium, the same machinery was calibrated to twenty-one administrative targets and hit all twenty-one within 1.8 percent; on that same population, per-record social-security contributions agreed with EUROMOD to within three eurocents per person per year. Each is a small, checkable number stating exactly how close the model came, worth more than any promise that it is right.</w:t>
       </w:r>
     </w:p>
     <w:bookmarkEnd w:id="108"/>
@@ -6095,7 +6075,7 @@
         <w:pStyle w:val="BodyText"/>
       </w:pPr>
       <w:r>
-        <w:t xml:space="preserve">A scorecard is deliberately small — a handful of numbers, fixed in advance, saying how closely the transferred population reproduced the real one on the dimensions that matter: how the income distribution lines up, how many households the model places on each benefit, how far the tails diverge. It carries none of the underlying records and none of their risk, and it is exactly the kind of low-dimensional summary a verification chain is allowed to end in. You do not need to see a country’s microdata to trust a model of it. You need a referee who has seen it, a test written down before the answers were known, and a score published where anyone can read it. That is less than full openness, and it is enough.</w:t>
+        <w:t xml:space="preserve">A scorecard is deliberately small — a handful of numbers, fixed in advance, saying how closely the transferred population reproduced the real one on the dimensions that matter: how the income distribution lines up, how many households the model places on each benefit, how far the tails diverge. It carries none of the underlying records and none of their risk, and it is exactly the kind of low-dimensional summary a verification chain is allowed to end in. Trust in a model of a country comes from a referee who has seen its microdata, a test written down before the answers were known, and a score published where anyone can read it. That is less than full openness, and it is enough.</w:t>
       </w:r>
     </w:p>
     <w:p>
@@ -6277,7 +6257,7 @@
         <w:t xml:space="preserve"> </w:t>
       </w:r>
       <w:r>
-        <w:t xml:space="preserve">— and separating the institutions does not cut the pipeline between them. It makes plain which half of every counterfactual is settled fact and which is open forecast. One honesty the docket enforces on itself: a conditional forecast is graded on the branch the world actually takes, and the branch not taken stays a projection, labeled as one.</w:t>
+        <w:t xml:space="preserve">— and separating the institutions leaves the pipeline between them intact while making plain which half of every counterfactual is settled fact and which is open forecast. One honesty the docket enforces on itself: a conditional forecast is graded on the branch the world actually takes, and the branch not taken stays a projection, labeled as one.</w:t>
       </w:r>
     </w:p>
     <w:p>
@@ -6343,7 +6323,7 @@
         <w:t xml:space="preserve"> </w:t>
       </w:r>
       <w:r>
-        <w:t xml:space="preserve">The institutions that produce official estimates do grade themselves in places — CBO publishes retrospectives on its aggregate budget and economic forecasts, real self-scrutiny that Part IV will credit properly. What no institution keeps is a standing, per-estimate ledger: a policy score is published, the vote happens, and nothing circles back to record what the world did to the number. The recomposition wires the tally in — not as a report card imposed from outside, but as the native output format of the prediction pole.</w:t>
+        <w:t xml:space="preserve">The institutions that produce official estimates do grade themselves in places — CBO publishes retrospectives on its aggregate budget and economic forecasts, real self-scrutiny that Part IV will credit properly. No institution we know of keeps a standing, per-estimate ledger: a policy score is published, the vote happens, and nothing circles back to record what the world did to the number. The recomposition wires the tally in as the native output format of the prediction pole rather than a report card imposed from outside.</w:t>
       </w:r>
     </w:p>
     <w:bookmarkEnd w:id="113"/>
@@ -6369,15 +6349,15 @@
         <w:pStyle w:val="BodyText"/>
       </w:pPr>
       <w:r>
-        <w:t xml:space="preserve">The Thesis Institute has to be wrong in public, and often. A docket that never missed would be a docket with its intervals padded uselessly wide, or one quietly declining the questions that are actually hard. The worth of a graded forecast comes precisely from the fact that some grades will be bad — visibly, on the record, with the interval printed beside the miss — because that is the only thing that makes the good grades worth anything. Public wrongness is the mission, not a risk run despite the mission. A forecaster who cannot be caught out is not being honest, only vague.</w:t>
-      </w:r>
-    </w:p>
-    <w:p>
-      <w:pPr>
-        <w:pStyle w:val="BodyText"/>
-      </w:pPr>
-      <w:r>
-        <w:t xml:space="preserve">The determinism pole cannot live that way for a moment. A calculator that a benefits screener consults, that a state agency wires into its eligibility workflow, that a tax product ships to customers, has exactly one job — to be right about what the law says — and its cardinal virtue is that it is boring: same input, same answer, matching the statute every time. Housed alongside the forecasting work, it would inherit a reputation it has no business carrying; every published miss on the scoreboard would raise the wrong question about the calculator. Technically the two share code and a population. Epistemically they make opposite kinds of claim, and the surest way to keep opposite claims from contaminating each other is to keep them under different roofs, with different promises attached to their names. One roof promises to be interesting and sometimes wrong. The other promises to be dull and always faithful. Wrongness isolation is a property of the design, not a vanity of the org chart.</w:t>
+        <w:t xml:space="preserve">The Thesis Institute has to be wrong in public, and often. A docket that never missed would be a docket with its intervals padded uselessly wide, or one quietly declining the questions that are actually hard. The worth of a graded forecast comes precisely from the fact that some grades will be bad — visibly, on the record, with the interval printed beside the miss — because that is the only thing that makes the good grades worth anything. Public wrongness is the mission. A forecaster who cannot be caught out is not being honest, only vague.</w:t>
+      </w:r>
+    </w:p>
+    <w:p>
+      <w:pPr>
+        <w:pStyle w:val="BodyText"/>
+      </w:pPr>
+      <w:r>
+        <w:t xml:space="preserve">The determinism pole cannot live that way for a moment. A calculator that a benefits screener consults, that a state agency wires into its eligibility workflow, that a tax product ships to customers, has exactly one job — to be right about what the law says — and its cardinal virtue is that it is boring: same input, same answer, matching the statute every time. Housed alongside the forecasting work, it would inherit a reputation it has no business carrying; every published miss on the scoreboard would raise the wrong question about the calculator. Technically the two share code and a population. Epistemically they make opposite kinds of claim, and the surest way to keep opposite claims from contaminating each other is to keep them under different roofs, with different promises attached to their names. One roof promises to be interesting and sometimes wrong. The other promises to be dull and always faithful.</w:t>
       </w:r>
     </w:p>
     <w:bookmarkEnd w:id="114"/>
@@ -6411,7 +6391,15 @@
         <w:pStyle w:val="BodyText"/>
       </w:pPr>
       <w:r>
-        <w:t xml:space="preserve">So who owns the whole? Nobody, and that is load-bearing design rather than evasion. A 501(c)(3) cannot be owned. The licenses on the rules, the data, and the scoreboard let anyone build without asking. No holding company sits above the poles, because the coherence lives in the pattern, not in any body that could be bought, captured, or pressured into changing course. Astronomy has a word for this. A constellation is official — there are eighty-eight, their boundaries chartered by the International Astronomical Union, one authority deciding where Orion ends. An asterism is the other thing: a shape everyone recognizes — the Big Dipper, the Summer Triangle — made of stars that belong to different constellations or to none, visible without any body ever declaring it. This structure is an asterism, and typography even supplies the mark: ⁂, three stars in a triangle, one for each of the three questions — law, forecast, values. The Greeks had a word too. When the villages of Attica joined into a single polis — the act tradition credits to Theseus — they called it</w:t>
+        <w:t xml:space="preserve">So who owns the whole? Nobody, and that is load-bearing design rather than evasion. A 501(c)(3) cannot be owned. The licenses on the rules, the data, and the scoreboard let anyone build without asking. No holding company sits above the poles, because the coherence lives in the pattern, not in any body that could be bought, captured, or pressured into changing course. Astronomy has a word for this. A constellation is official — there are eighty-eight, their boundaries chartered by the International Astronomical Union, one authority deciding where Orion ends. An asterism is the other thing: a shape everyone recognizes — the Big Dipper, the Summer Triangle — made of stars that belong to different constellations or to none, visible without any body ever declaring it. This structure is an asterism, and typography even supplies the mark: ⁂, three stars in a triangle, one for each of the three questions — law, forecast, values.</w:t>
+      </w:r>
+    </w:p>
+    <w:p>
+      <w:pPr>
+        <w:pStyle w:val="BodyText"/>
+      </w:pPr>
+      <w:r>
+        <w:t xml:space="preserve">The Greeks had a word too. When the villages of Attica joined into a single polis — the act tradition credits to Theseus — they called it</w:t>
       </w:r>
       <w:r>
         <w:t xml:space="preserve"> </w:t>
@@ -6450,7 +6438,7 @@
         <w:t xml:space="preserve">thesis</w:t>
       </w:r>
       <w:r>
-        <w:t xml:space="preserve">. The founder-myth of federation without absorption shares a root with the institute that places propositions before reality and waits for the grade.</w:t>
+        <w:t xml:space="preserve">.</w:t>
       </w:r>
     </w:p>
     <w:bookmarkEnd w:id="115"/>
@@ -6484,15 +6472,15 @@
         <w:pStyle w:val="BodyText"/>
       </w:pPr>
       <w:r>
-        <w:t xml:space="preserve">What changed to make the pattern viable now was never the openness of the corpus; it was the unit cost of computing it. For most of history the corpus of public life sat un-computed not because it was hidden but because computing it did not pay: encoding a single statute faithfully took a trained specialist days, and there are millions of provisions across thousands of jurisdictions; forecasting the budget of every county would take analysts nobody would fund. So law stayed on paper, microdata stayed in survey files, metrics went unforecast — public in principle, computed almost nowhere. An agent can encode a country’s tax-benefit system in days, hold tens of thousands of provisions in view at once, draft a forecast for every metric on a docket, and never tire. The corpus was always open. The missing piece was a way to compute it that was cheap enough to attempt at scale and disciplined enough to trust, and the gate supplies the second half.</w:t>
-      </w:r>
-    </w:p>
-    <w:p>
-      <w:pPr>
-        <w:pStyle w:val="BodyText"/>
-      </w:pPr>
-      <w:r>
-        <w:t xml:space="preserve">Run the test forward and the docket of candidate corpora is long, because most of public life shares the one property that matters — already written down, not yet computed. Local zoning codes are public, largely un-encoded, and checkable line by line against the ordinance text: a national map of what may legally be built where, assembled the way the tax code was. The fiscal futures of tens of thousands of county and municipal governments are forecastable and, in time, gradable against the budgets those governments actually adopt. Bills introduced in a legislature could be scored the day they drop, run through the same engine that scores enacted law, so a proposal arrives with its distributional consequences attached. None of this is a promise. Each is a direction, and each earns its place only if it clears the same gate — per-unit verifiability against something real.</w:t>
+        <w:t xml:space="preserve">What changed to make the pattern viable now was the unit cost of computing the corpus. For most of history the corpus of public life sat un-computed because computing it did not pay: encoding a single statute faithfully took a trained specialist days, and there are millions of provisions across thousands of jurisdictions; forecasting the budget of every county would take analysts nobody would fund. So law stayed on paper, microdata stayed in survey files, metrics went unforecast — public in principle, computed almost nowhere. An agent can encode a country’s tax-benefit system in days, hold tens of thousands of provisions in view at once, draft a forecast for every metric on a docket, and never tire. The corpus was always open. The missing piece was a way to compute it that was cheap enough to attempt at scale and disciplined enough to trust, and the gate supplies the second half.</w:t>
+      </w:r>
+    </w:p>
+    <w:p>
+      <w:pPr>
+        <w:pStyle w:val="BodyText"/>
+      </w:pPr>
+      <w:r>
+        <w:t xml:space="preserve">Run the test forward and the docket of candidate corpora is long, because most of public life shares the one property that matters — already written down, not yet computed. Local zoning codes are public, largely un-encoded, and checkable line by line against the ordinance text: a national map of what may legally be built where, assembled the way the tax code was. The fiscal futures of tens of thousands of county and municipal governments are forecastable and, in time, gradable against the budgets those governments actually adopt. Bills introduced in a legislature could be scored the day they drop, run through the same engine that scores enacted law, so a proposal arrives with its distributional consequences attached. Each of these is a direction rather than a promise, and each earns its place only if it clears the same gate — per-unit verifiability against something real.</w:t>
       </w:r>
     </w:p>
     <w:bookmarkEnd w:id="116"/>
@@ -6518,15 +6506,15 @@
         <w:pStyle w:val="BodyText"/>
       </w:pPr>
       <w:r>
-        <w:t xml:space="preserve">That one has no institute, and it may be the hardest of the three to anchor in ground truth, because its truth is not a statute or a first-print statistic. It is something latent in a population’s own preferences — harder to observe, easier to distort, and quick to punish anyone who claims to speak for it. The embryo exists: HiveSight, a survey-simulation tool that tries to elicit and forecast what populations think the way the other layers elicit rules and metrics. The later chapters take it up and benchmark it honestly, which is the only way this book is allowed to take anything up. Rules, predictions, values: the third primitive is at once the frontier of the whole program and its least finished piece — the place where a book about computing the government becomes a book about what the government is for. There is a version of this stack whose deepest payoff is not any single number but a shared, verifiable substrate everyone can reason against, so that public disagreement can finally be about ends rather than about whose figures are right.</w:t>
-      </w:r>
-    </w:p>
-    <w:p>
-      <w:pPr>
-        <w:pStyle w:val="BodyText"/>
-      </w:pPr>
-      <w:r>
-        <w:t xml:space="preserve">That is the horizon, not the next step. Before values, the book owes a debt it has been running up since Part I. Every estimate in every preceding chapter arrived as a single number — a cost, a poverty rate, a marginal rate — without an honest account of its own uncertainty. This reform costs fifty billion dollars: plus or minus what, and how would we know? The prediction pole exists to answer exactly that question, to turn a bare point estimate into a graded interval with a date on it. And so Part IV begins not with what we want, but with how sure we can be of what we already claim to know.</w:t>
+        <w:t xml:space="preserve">That one has no institute, and it may be the hardest of the three to anchor in ground truth, because no statute or first-print statistic holds its truth. It sits latent in a population’s own preferences — harder to observe, easier to distort, and quick to punish anyone who claims to speak for it. The embryo exists: HiveSight, a survey-simulation tool that tries to elicit and forecast what populations think the way the other layers elicit rules and metrics. The later chapters take it up and benchmark it honestly, which is the only way this book is allowed to take anything up. Rules, predictions, values: the third primitive is at once the frontier of the whole program and its least finished piece — the place where a book about computing the government becomes a book about what the government is for. There is a version of this stack whose deepest payoff is not any single number but a shared, verifiable substrate everyone can reason against, so that public disagreement can finally be about ends rather than about whose figures are right.</w:t>
+      </w:r>
+    </w:p>
+    <w:p>
+      <w:pPr>
+        <w:pStyle w:val="BodyText"/>
+      </w:pPr>
+      <w:r>
+        <w:t xml:space="preserve">That is the horizon. Before values, the book owes a debt it has been running up since Part I. Every estimate in every preceding chapter arrived as a single number — a cost, a poverty rate, a marginal rate — without an honest account of its own uncertainty. This reform costs fifty billion dollars: plus or minus what, and how would we know? The prediction pole exists to answer exactly that question, to turn a bare point estimate into a graded interval with a date on it. And so, before what we want, Part IV begins with how sure we can be of what we already claim to know.</w:t>
       </w:r>
     </w:p>
     <w:bookmarkEnd w:id="117"/>
@@ -6753,7 +6741,7 @@
         <w:pStyle w:val="BodyText"/>
       </w:pPr>
       <w:r>
-        <w:t xml:space="preserve">So why does the single number persist? Not mainly technical oversight. Reconciliation rules require one cost figure, not a distribution. A journalist needs a headline. An advocate needs a talking point —</w:t>
+        <w:t xml:space="preserve">So why does the single number persist? Because everyone downstream needs it. Reconciliation rules require one cost figure, not a distribution. A journalist needs a headline. An advocate needs a talking point —</w:t>
       </w:r>
       <w:r>
         <w:t xml:space="preserve"> </w:t>
@@ -6811,15 +6799,7 @@
         <w:pStyle w:val="FirstParagraph"/>
       </w:pPr>
       <w:r>
-        <w:t xml:space="preserve">The methods for exposing uncertainty exist, and each buys a different slice of it.</w:t>
-      </w:r>
-    </w:p>
-    <w:p>
-      <w:pPr>
-        <w:pStyle w:val="BodyText"/>
-      </w:pPr>
-      <w:r>
-        <w:t xml:space="preserve">Monte Carlo simulation runs the model many times with inputs drawn from probability distributions and reports the spread. I use it in EggNest, a retirement-planning tool I built: instead of</w:t>
+        <w:t xml:space="preserve">The methods for exposing uncertainty exist, and each buys a different slice of it. Monte Carlo simulation runs the model many times with inputs drawn from probability distributions and reports the spread. I use it in EggNest, a retirement-planning tool I built: instead of</w:t>
       </w:r>
       <w:r>
         <w:t xml:space="preserve"> </w:t>
@@ -6913,7 +6893,7 @@
         <w:t xml:space="preserve"> </w:t>
       </w:r>
       <w:r>
-        <w:t xml:space="preserve">is not hedging; it is a calibrated probability, meaning that across many such forecasts, it rains on close to 60 percent of the days so labeled.</w:t>
+        <w:t xml:space="preserve">is a calibrated probability: across many such forecasts, it rains on close to 60 percent of the days so labeled.</w:t>
       </w:r>
     </w:p>
     <w:p>
@@ -7074,39 +7054,15 @@
         <w:pStyle w:val="BodyText"/>
       </w:pPr>
       <w:r>
-        <w:t xml:space="preserve">The Thesis Institute is that loop built as an institution. The name carries the division of labor: an axiom is accepted truth; a thesis is a proposition put up to be tested. What gets tested is a forecast of a government metric, published with an interval, before the number is known. The mechanism is a public docket. Each entry forecasts an official statistic — say, the first-print unemployment rate for a given month, meaning the value as the Bureau of Labor Statistics first publishes it, before later revisions. Fixing the target on the first print makes the eventual grade well-defined rather than a matter for argument. Each forecast carries an interval rather than a point. Each is timestamped and locked. When the official number lands, the ledger records the fact, marks the forecast against its stated interval, and leaves the score where it was made, for anyone to read.</w:t>
-      </w:r>
-    </w:p>
-    <w:p>
-      <w:pPr>
-        <w:pStyle w:val="BodyText"/>
-      </w:pPr>
-      <w:r>
-        <w:t xml:space="preserve">Remember the problem with grading policy scores: the counterfactual never prints. The docket is built to respect that rather than promise around it. Its unconditional entries — next month’s unemployment print, next quarter’s caseload under the law as it stands — resolve directly. Its counterfactual pages are conditional forecasts: one live entry forecasts Medicaid call-center wait times in March 2027</w:t>
-      </w:r>
-      <w:r>
-        <w:t xml:space="preserve"> </w:t>
-      </w:r>
-      <w:r>
-        <w:rPr>
-          <w:i/>
-          <w:iCs/>
-        </w:rPr>
-        <w:t xml:space="preserve">if</w:t>
-      </w:r>
-      <w:r>
-        <w:t xml:space="preserve"> </w:t>
-      </w:r>
-      <w:r>
-        <w:t xml:space="preserve">the work-requirement verification deadline is delayed. If the deadline is delayed, March 2027 prints a real number and the forecast takes its grade; if it is not, the entry expires unscored, and the ledger says so. A conditional forecast resolves only on the branch the world takes, and the causal gap between branches — the thing the AHCA’s 23 million actually claimed — never resolves at all; the ledger labels which kind of object each entry is instead of letting a scenario impersonate a testable claim. That is weaker than grading every policy score. It is also the honest version, and it still transforms the field it touches: each estimate the earlier chapters produced that names something reality will print — a caseload, a revenue line, the poverty rate the Census Bureau will publish — can now become a forecast with a published interval and a resolution date, held to the weather standard: verified probabilities, recalibrated on misses.</w:t>
-      </w:r>
-    </w:p>
-    <w:p>
-      <w:pPr>
-        <w:pStyle w:val="BodyText"/>
-      </w:pPr>
-      <w:r>
-        <w:t xml:space="preserve">This is the accountability loop that CBO, the Tax Policy Center, and Europe’s EUROMOD teams do not have — not for want of rigor, but because their retrospectives evaluate aggregate accuracy after the fact, and the loop requires per-forecast commitments made in advance. The institute launches publicly in mid-September 2026. And as I write, not one of its forecasts has resolved. The first grades are months away; the record that would justify your trust is years away. A scoreboard that glowed on launch day would deserve suspicion for exactly that reason — the glow would have been assembled where nobody could watch. The only credible path is the slow one: publish before the outcome is known, and let the outcomes accumulate in the open, misses included. Misses especially, since the misses are what recalibrate the machine.</w:t>
+        <w:t xml:space="preserve">The Thesis Institute is that loop built as an institution: the last chapter’s public docket of forecasts of government metrics, each locked with an interval before the number is known and graded when the official number lands. Remember the problem with grading policy scores: the counterfactual never prints. The docket is built to respect that rather than promise around it. Its unconditional entries — next month’s unemployment print, next quarter’s caseload under the law as it stands — resolve directly. Its conditional entries, the Medicaid wait-time page among them, resolve only on the branch the world takes; on the branch not taken, the entry expires unscored, and the ledger says so. The causal gap between branches — the thing the AHCA’s 23 million actually claimed — never resolves at all, and the ledger labels which kind of object each entry is instead of letting a scenario impersonate a testable claim.</w:t>
+      </w:r>
+    </w:p>
+    <w:p>
+      <w:pPr>
+        <w:pStyle w:val="BodyText"/>
+      </w:pPr>
+      <w:r>
+        <w:t xml:space="preserve">That is weaker than grading every policy score. It is also the honest version, and it still transforms the field it touches: each estimate the earlier chapters produced that names something reality will print — a caseload, a revenue line, the poverty rate the Census Bureau will publish — can now become a forecast with a published interval and a resolution date, held to the weather standard: verified probabilities, recalibrated on misses. The discipline this book keeps applying to other people’s tools lands hardest here, on the institution built to enforce it.</w:t>
       </w:r>
     </w:p>
     <w:p>
@@ -7115,14 +7071,6 @@
       </w:pPr>
       <w:r>
         <w:t xml:space="preserve">There is no track record — only a mechanism for acquiring one, in public.</w:t>
-      </w:r>
-    </w:p>
-    <w:p>
-      <w:pPr>
-        <w:pStyle w:val="BodyText"/>
-      </w:pPr>
-      <w:r>
-        <w:t xml:space="preserve">The discipline this book keeps applying to other people’s tools lands hardest here, on the institution built to enforce it. The prediction pole asks to be checked later, not believed now.</w:t>
       </w:r>
     </w:p>
     <w:bookmarkEnd w:id="125"/>
@@ -7302,14 +7250,6 @@
         <w:t xml:space="preserve">with a $100 million Series A led by Index Ventures and an argument that simulation, not prediction alone, is AI’s next frontier. The field’s most captivating demo had become a company. Synthetic respondents were going to be sold whatever the literature concluded, and for public-interest use the bar sits where the pitch rarely goes: are the numbers calibrated, is the uncertainty stated, and has anyone measured the operating range against ground truth the model could not have memorized?</w:t>
       </w:r>
     </w:p>
-    <w:p>
-      <w:pPr>
-        <w:pStyle w:val="BodyText"/>
-      </w:pPr>
-      <w:r>
-        <w:t xml:space="preserve">That is the test I decided to put my own version of the idea through.</w:t>
-      </w:r>
-    </w:p>
     <w:bookmarkEnd w:id="129"/>
     <w:bookmarkStart w:id="130" w:name="a-thousand-personas"/>
     <w:p>
@@ -7417,7 +7357,7 @@
         <w:pStyle w:val="BodyText"/>
       </w:pPr>
       <w:r>
-        <w:t xml:space="preserve">What is a tie good for? Suppose a city council is weighing congestion pricing, a $15 charge to drive downtown at peak hours, and a real survey would cost $30,000 to $50,000 and take three weeks. HiveSight can take the city’s demographic composition, elicit a distribution for each cell, and return an estimate in minutes: say, 62 percent opposition, heaviest among middle-income commuters who cannot easily switch to transit, lighter among low-income residents who do not drive and high-income residents who shrug at the charge. The percentages are invented; the decision they inform is not. If simulated opposition runs 90 percent in every cell, shelve the idea and save the survey budget. If the split is close and structured, field the real survey, and go in knowing which subgroups to oversample. The estimate is a triage instrument, not a referendum.</w:t>
+        <w:t xml:space="preserve">What is a tie good for? Suppose a city council is weighing congestion pricing, a $15 charge to drive downtown at peak hours, and a real survey would cost $30,000 to $50,000 and take three weeks. HiveSight can take the city’s demographic composition, elicit a distribution for each cell, and return an estimate in minutes: say, 62 percent opposition, heaviest among middle-income commuters who cannot easily switch to transit, lighter among low-income residents who do not drive and high-income residents who shrug at the charge. The percentages are invented; the decision they inform is real. If simulated opposition runs 90 percent in every cell, shelve the idea and save the survey budget. If the split is close and structured, field the real survey, and go in knowing which subgroups to oversample. The estimate is a triage instrument.</w:t>
       </w:r>
     </w:p>
     <w:bookmarkEnd w:id="132"/>
@@ -7435,7 +7375,23 @@
         <w:pStyle w:val="FirstParagraph"/>
       </w:pPr>
       <w:r>
-        <w:t xml:space="preserve">The errors that remain inside the operating range are not random, which is the good news hiding in the bad. Models train mostly on text from Western, educated, industrialized, rich, democratic populations (WEIRD, in the acronym psychologists use), so they simulate Americans better than Nigerians and college graduates better than high-school dropouts, converting the training data’s gaps into systematic error for exactly the groups surveys already undercount. Models drift toward central tendencies and sand off the extremes; real opinion has long tails, full of outliers and contradictions and people who defy their demographics, and silicon samples come out too clean: Bisbee’s finding, now with a mechanism attached. A model renders the world up to its training cutoff and not a day past it, so it cannot answer to the event it never saw — a pandemic, a crash, last week’s viral video; the hard cutoff that made the contamination control possible makes the tool blind at the frontier, where opinion actually moves. Safety tuning trains models to be agreeable, so they hesitate to voice the extreme and unpopular views that some real, demographically matching humans hold: a sanitized public. And handed a demographic label, a model sometimes returns the caricature instead of the range; prompt it as a rural evangelical and you may get the cartoon.</w:t>
+        <w:t xml:space="preserve">The errors that remain inside the operating range are not random, which is the good news hiding in the bad. Models train mostly on text from Western, educated, industrialized, rich, democratic populations (WEIRD, in the acronym psychologists use), so they simulate Americans better than Nigerians and college graduates better than high-school dropouts. The training data’s gaps become systematic error for exactly the groups surveys already undercount.</w:t>
+      </w:r>
+    </w:p>
+    <w:p>
+      <w:pPr>
+        <w:pStyle w:val="BodyText"/>
+      </w:pPr>
+      <w:r>
+        <w:t xml:space="preserve">Models also drift toward central tendencies and sand off the extremes. Real opinion has long tails, full of outliers and contradictions and people who defy their demographics, and silicon samples come out too clean — Bisbee’s finding, now with a mechanism attached. A third limit is time. A model renders the world up to its training cutoff and not a day past it, so it cannot answer to the event it never saw — a pandemic, a crash, last week’s viral video. The hard cutoff that made the contamination control possible makes the tool blind at the frontier, where opinion actually moves.</w:t>
+      </w:r>
+    </w:p>
+    <w:p>
+      <w:pPr>
+        <w:pStyle w:val="BodyText"/>
+      </w:pPr>
+      <w:r>
+        <w:t xml:space="preserve">Safety tuning adds a fourth distortion. Trained to be agreeable, models hesitate to voice the extreme and unpopular views that some real, demographically matching humans hold: a sanitized public. And the fifth arrives with the prompt itself. Handed a demographic label, a model sometimes returns the caricature instead of the range; prompt it as a rural evangelical and you may get the cartoon.</w:t>
       </w:r>
     </w:p>
     <w:p>
@@ -7551,7 +7507,7 @@
         <w:pStyle w:val="BodyText"/>
       </w:pPr>
       <w:r>
-        <w:t xml:space="preserve">Sized honestly, the work in this chapter is the embryo of a third primitive, beside the rules that state and the forecasts that resolve: values elicitation, machinery for hearing what people want. There is a version that plugs into everything this book has built — simulate a policy against the population, then simulate the public’s reaction to it, the same household profiles carrying both the budget effect and the opinion, each wearing its error bars. But a distribution of what people think is an input, not a decision. What a society does with its opinions — how it counts them, weighs them, protects the dissenters the models round away, and turns the whole contested spread into one choice everyone must live under — has no benchmark at all. That question is the horizon, and the last part of this book walks out to it.</w:t>
+        <w:t xml:space="preserve">Sized honestly, the work in this chapter is the embryo of a third primitive, beside the rules that state and the forecasts that resolve: values elicitation, machinery for hearing what people want. There is a version that plugs into everything this book has built — simulate a policy against the population, then simulate the public’s reaction to it, the same household profiles carrying both the budget effect and the opinion, each wearing its error bars. But a distribution of what people think is only an input. What a society does with its opinions — how it counts them, weighs them, protects the dissenters the models round away, and turns the whole contested spread into one choice everyone must live under — has no benchmark at all. That question is the horizon, and the last part of this book walks out to it.</w:t>
       </w:r>
     </w:p>
     <w:bookmarkEnd w:id="135"/>
@@ -7662,7 +7618,7 @@
         <w:pStyle w:val="BodyText"/>
       </w:pPr>
       <w:r>
-        <w:t xml:space="preserve">Consider a voter I am inventing on purpose. Sarah teaches school, has two kids, and faces a choice between two candidates: one would expand the Child Tax Credit, the other would repeal her state’s income tax. Which leaves her family better off? Without doing the arithmetic she has to guess. The state income tax stings visibly on every pay stub. She remembers the expanded pandemic-era credit helping. The ads on both sides are built to persuade her, not to inform her. Her eventual vote blends what she values, what she believes each policy would do, what her party and her neighbors support, and noise — a candidate’s charisma, the morning’s headlines. Even if her values are perfectly clear, her vote may fail to track them, because she cannot see the true impacts. She votes on a noisy signal.</w:t>
+        <w:t xml:space="preserve">Consider a voter I am inventing on purpose. Sarah teaches school, has two kids, and faces a choice between two candidates: one would expand the Child Tax Credit, the other would repeal her state’s income tax. Which leaves her family better off? Without doing the arithmetic she has to guess. The state income tax stings visibly on every pay stub. She remembers the expanded pandemic-era credit helping. The ads on both sides are built to persuade her. Her eventual vote blends what she values, what she believes each policy would do, what her party and her neighbors support, and noise — a candidate’s charisma, the morning’s headlines. Even if her values are perfectly clear, her vote may fail to track them, because she cannot see the true impacts. She votes on a noisy signal.</w:t>
       </w:r>
     </w:p>
     <w:p>
@@ -7857,15 +7813,31 @@
         <w:pStyle w:val="FirstParagraph"/>
       </w:pPr>
       <w:r>
-        <w:t xml:space="preserve">Some constraints sit deeper than perception. Kenneth Arrow proved in 1951 that no ranked voting system can satisfy a short list of reasonable fairness conditions at once; Gibbard and Satterthwaite later showed that any non-dictatorial voting system can be gamed by strategic voting. Better inputs repeal neither theorem. But the theorems constrain the aggregation mechanism, not the quality of what feeds it. An imperfect aggregator still delivers better outcomes from better-informed inputs; Arrow proved that no perfect system exists, not that every system performs identically regardless of what its voters know. If anything, the theorems sharpen the chapter’s point: since the mechanism cannot be perfected, the inputs are where the improvement lives.</w:t>
-      </w:r>
-    </w:p>
-    <w:p>
-      <w:pPr>
-        <w:pStyle w:val="BodyText"/>
-      </w:pPr>
-      <w:r>
-        <w:t xml:space="preserve">Three objections deserve direct answers. Maybe the preferences are the problem, not the perceptions — true, and orthogonal: voters who want harmful things and perceive accurately will get harmful things, which is a different failure from wanting good things and misperceiving. Better perception at least delivers people what they actually want, the precondition for holding them responsible for wanting it. Information won’t reach the disengaged — partly true; a non-voter will not open a policy calculator, and the citizens who would are already the relatively informed. But the interface is moving to where people already are: an AI assistant that volunteers a policy’s household impact reaches past the self-selected, and upgrading the moderately informed still improves the signal. Calculated self-interest isn’t citizenship — fair, and the same engine computes poverty rates, inequality, and total budgetary cost as readily as one household’s bottom line. The point is replacing perception with calculation, whatever a voter chooses to weigh.</w:t>
+        <w:t xml:space="preserve">Some constraints sit deeper than perception. Kenneth Arrow proved in 1951 that no ranked voting system can satisfy a short list of reasonable fairness conditions at once; Gibbard and Satterthwaite later showed that any non-dictatorial voting system can be gamed by strategic voting. Better inputs repeal neither theorem. But the theorems constrain the aggregation mechanism, not the quality of what feeds it. An imperfect aggregator still delivers better outcomes from better-informed inputs; Arrow ruled out a perfect system, nothing more. If anything, the theorems sharpen the chapter’s point: since the mechanism cannot be perfected, the inputs are where the improvement lives.</w:t>
+      </w:r>
+    </w:p>
+    <w:p>
+      <w:pPr>
+        <w:pStyle w:val="BodyText"/>
+      </w:pPr>
+      <w:r>
+        <w:t xml:space="preserve">Three objections deserve direct answers. Maybe the preferences are the problem, not the perceptions. True, and orthogonal: voters who want harmful things and perceive accurately will get harmful things, which is a different failure from wanting good things and misperceiving. Better perception at least delivers people what they actually want, the precondition for holding them responsible for wanting it.</w:t>
+      </w:r>
+    </w:p>
+    <w:p>
+      <w:pPr>
+        <w:pStyle w:val="BodyText"/>
+      </w:pPr>
+      <w:r>
+        <w:t xml:space="preserve">Maybe information won’t reach the disengaged. Partly true: a non-voter will not open a policy calculator, and the citizens who would are already the relatively informed. But the interface is moving to where people already are. An AI assistant that volunteers a policy’s household impact reaches past the self-selected, and upgrading the moderately informed still improves the signal.</w:t>
+      </w:r>
+    </w:p>
+    <w:p>
+      <w:pPr>
+        <w:pStyle w:val="BodyText"/>
+      </w:pPr>
+      <w:r>
+        <w:t xml:space="preserve">Maybe calculated self-interest isn’t citizenship. Fair, and the same engine computes poverty rates, inequality, and total budgetary cost as readily as one household’s bottom line. The point is replacing perception with calculation, whatever a voter chooses to weigh.</w:t>
       </w:r>
     </w:p>
     <w:p>
@@ -8165,7 +8137,7 @@
         <w:pStyle w:val="FirstParagraph"/>
       </w:pPr>
       <w:r>
-        <w:t xml:space="preserve">There is a further complication, and the honest version of this chapter has to carry it, because it sits directly under the centerpiece. The GSS changed how it collects answers. Facing the pandemic, the 2021 round moved from in-person interviewing to an address-based, push-to-web design, and its response rate fell to roughly 17 percent, against roughly 50 percent in 2022. Mode matters for exactly this kind of question: answering a screen instead of a person removes social-desirability pressure, and self-administration tends to raise the share giving the franker answer — including</w:t>
+        <w:t xml:space="preserve">The GSS changed how it collects answers, and the change sits directly under this chapter’s centerpiece. Facing the pandemic, the 2021 round moved from in-person interviewing to an address-based, push-to-web design, and its response rate fell to roughly 17 percent, against roughly 50 percent in 2022. Mode matters for exactly this kind of question: answering a screen instead of a person removes social-desirability pressure, and self-administration tends to raise the share giving the franker answer — including</w:t>
       </w:r>
       <w:r>
         <w:t xml:space="preserve"> </w:t>
@@ -8237,7 +8209,7 @@
         <w:pStyle w:val="BodyText"/>
       </w:pPr>
       <w:r>
-        <w:t xml:space="preserve">Across the twenty items, the language models’ errors ran 3.9 to 4.1 points against persistence’s 3.15. A frontier reasoning model did no better than the cheap ones, and raising a model’s reasoning effort made its accuracy slightly worse, not better. The models’ 90 percent intervals covered the truth about half the time; properly computed classical intervals covered at their stated rate. And the 2024 wave turned out to be stranger than one famous reversal: eight of the twenty items broke their pre-2022 trend, and four of them — approval of the school-prayer ban, same-sex relations, rejection of traditional gender roles, and marijuana legalization — posted the largest single-wave declines in their items’ recorded histories. Every arm, model and baseline alike, missed the same-sex reversal again, with point forecasts between 60 and 66 against an actual of roughly 55; the only interval that contained the truth managed it by being twenty-one points wide.</w:t>
+        <w:t xml:space="preserve">Across the twenty items, the language models’ errors ran 3.9 to 4.1 points against persistence’s 3.15. A frontier reasoning model did no better than the cheap ones, and raising a model’s reasoning effort made its accuracy slightly worse. The models’ 90 percent intervals covered the truth about half the time; properly computed classical intervals covered at their stated rate. And the 2024 wave turned out to be stranger than one famous reversal: eight of the twenty items broke their pre-2022 trend, and four of them — approval of the school-prayer ban, same-sex relations, rejection of traditional gender roles, and marijuana legalization — posted the largest single-wave declines in their items’ recorded histories. Every arm, model and baseline alike, missed the same-sex reversal again, with point forecasts between 60 and 66 against an actual of roughly 55; the only interval that contained the truth managed it by being twenty-one points wide.</w:t>
       </w:r>
     </w:p>
     <w:p>
@@ -8341,7 +8313,7 @@
         <w:t xml:space="preserve"> </w:t>
       </w:r>
       <w:r>
-        <w:t xml:space="preserve">It does not, and it should not. Grant the method perfect foresight and people would still hold different things dear; the object worth forecasting is a distribution across a population, not a point on a line. The reframing has teeth for anything that would consume the forecast. A point estimate invites a system to optimize toward it. A distribution refuses: it says that at the end of any plausible reflection there remain people who weigh liberty over welfare and people who weigh welfare over liberty, and that both are part of the answer rather than error bars around it. A system that took the distribution seriously would favor actions that score acceptably across several value systems over actions that score maximally within one, grow cautious where the value systems disagree most, and treat a move that catastrophically violates any large minority as disqualified rather than merely outvoted. That is value pluralism recast as an engineering constraint — closer to a robustness requirement than a moral theory.</w:t>
+        <w:t xml:space="preserve">It does not, and it should not. Grant the method perfect foresight and people would still hold different things dear; the object worth forecasting is the whole distribution across a population. The reframing has teeth for anything that would consume the forecast. A point estimate invites a system to optimize toward it. A distribution refuses: it says that at the end of any plausible reflection there remain people who weigh liberty over welfare and people who weigh welfare over liberty, and that both are part of the answer rather than error bars around it. A system that took the distribution seriously would favor actions that score acceptably across several value systems over actions that score maximally within one, grow cautious where the value systems disagree most, and treat a move that catastrophically violates any large minority as disqualified rather than merely outvoted. That is value pluralism recast as an engineering constraint — closer to a robustness requirement than a moral theory.</w:t>
       </w:r>
     </w:p>
     <w:p>
@@ -8367,7 +8339,7 @@
         <w:pStyle w:val="FirstParagraph"/>
       </w:pPr>
       <w:r>
-        <w:t xml:space="preserve">Any forecast of values carries two kinds of uncertainty that do not reduce to each other. Aleatoric uncertainty is the genuine spread of values across people — not ignorance but reality, because a perfect model of a population that will never agree still reports disagreement. Epistemic uncertainty is our uncertainty about what that spread even is: a distribution over distributions, which better data, longer histories, and better methods narrow. They demand different responses. Epistemic uncertainty is the part you can pay to reduce — more surveys, more countries, sterner calibration. Aleatoric uncertainty is the part you must design around, because it remains when the study is done. Both belong in the output, quantified separately: not</w:t>
+        <w:t xml:space="preserve">Any forecast of values carries two kinds of uncertainty that do not reduce to each other. Aleatoric uncertainty is the genuine spread of values across people: a perfect model of a population that will never agree still reports disagreement. Epistemic uncertainty is our uncertainty about what that spread even is: a distribution over distributions, which better data, longer histories, and better methods narrow. They demand different responses. Epistemic uncertainty is the part you can pay to reduce — more surveys, more countries, sterner calibration. Aleatoric uncertainty is the part you must design around, because it remains when the study is done. Both belong in the output, quantified separately: not</w:t>
       </w:r>
       <w:r>
         <w:t xml:space="preserve"> </w:t>
@@ -8397,7 +8369,7 @@
         <w:pStyle w:val="FirstParagraph"/>
       </w:pPr>
       <w:r>
-        <w:t xml:space="preserve">The deepest problem is not statistical. The appeal of forecasting values is the hope that where attitudes are heading is better than where they are — that the forecast points forward in judgment, not just in time. Nothing in the data licenses that hope. That support for same-sex marriage rose from 27 percent to about seven in ten within a generation shows that time passed and attitudes moved; it does not show that anyone reasoned more carefully. The engines of value change — generational replacement, media exposure, information cascades, tribal signaling — are sociological, not epistemic. A model that predicts them predicts a social process, not a deliberative one. Some shifts plainly track moral progress: abolition, the widening of the franchise. Others may be drift with no progress in them. Others might be backlash to perceived overreach — one live reading of the 2024 reversal, and if that reading is right, a model that</w:t>
+        <w:t xml:space="preserve">The deepest problem is not statistical. The appeal of forecasting values is the hope that where attitudes are heading is better than where they are — that the forecast points forward in judgment, not just in time. Nothing in the data licenses that hope. That support for same-sex marriage rose from 27 percent to about seven in ten within a generation shows that time passed and attitudes moved; it does not show that anyone reasoned more carefully. The engines of value change are sociological — generational replacement, media exposure, information cascades, tribal signaling. A model that predicts them predicts a social process, not a deliberative one. Some shifts plainly track moral progress: abolition, the widening of the franchise. Others may be drift with no progress in them. Others might be backlash to perceived overreach — one live reading of the 2024 reversal, and if that reading is right, a model that</w:t>
       </w:r>
       <w:r>
         <w:t xml:space="preserve"> </w:t>
@@ -8481,7 +8453,39 @@
         <w:pStyle w:val="FirstParagraph"/>
       </w:pPr>
       <w:r>
-        <w:t xml:space="preserve">Suppose the method someday worked: calibrated, replicated, graded forward for years. It would immediately become a technology of power, and who held it would matter as much as how accurate it was. A government could dress paternalism as foresight. A firm could steer preferences rather than serve them. A lab could align a system to projected values that happened to coincide with its own interests. Before any of it earned authority, the adversarial questions would need answers. Who generates the forecasts, and under whose incentives? Academics, agencies, and companies each bring different accountability, and none should hold a monopoly; distributed production under open methods can at least be checked. Which conditioning assumptions are on the table? A forecast conditioned on broad deliberation differs from one conditioned on polarized media, and the choice between them is itself a value judgment that must be stated where it can be argued with. What is democratic input for? Forecasts should inform deliberation and never stand in for it; citizens must be able to examine the method, challenge the assumptions, and reject a forecast-based justification outright. How do disputes get resolved? Contested forecasts need appeals — replication, public comment, independent review — not an oracle’s say-so. And the hardest one: what happens when the forecast and today’s expressed values disagree? The honest answer stays uncertain, and the 2024 reversal is the standing cautionary tale, because a 2020 projection of continued acceptance, used to justify anything at all, would have been overconfident within four years. Whatever governs this work has to be built to absorb surprise and revise — built like the scoreboard, not like a prophet.</w:t>
+        <w:t xml:space="preserve">Suppose the method someday worked: calibrated, replicated, graded forward for years. It would immediately become a technology of power, and who held it would matter as much as how accurate it was. A government could dress paternalism as foresight. A firm could steer preferences rather than serve them. A lab could align a system to projected values that happened to coincide with its own interests. And a forecast would not need a steering hand to move its own target: publishing that a shift is coming could accelerate the shift or suppress it. That feedback runs through all social science and is no reason to stop; it is a reason the adversarial questions would need answers before any of it earned authority.</w:t>
+      </w:r>
+    </w:p>
+    <w:p>
+      <w:pPr>
+        <w:pStyle w:val="BodyText"/>
+      </w:pPr>
+      <w:r>
+        <w:t xml:space="preserve">Who generates the forecasts, and under whose incentives? A university lab answers to peer review, a statistical agency to its legislature, a company to its shareholders — different accountabilities, and none should hold a monopoly. Distributed production under open methods can at least be checked.</w:t>
+      </w:r>
+    </w:p>
+    <w:p>
+      <w:pPr>
+        <w:pStyle w:val="BodyText"/>
+      </w:pPr>
+      <w:r>
+        <w:t xml:space="preserve">Which conditioning assumptions are on the table? A forecast conditioned on broad deliberation differs from one conditioned on polarized media, and the choice between them is itself a value judgment that must be stated where it can be argued with.</w:t>
+      </w:r>
+    </w:p>
+    <w:p>
+      <w:pPr>
+        <w:pStyle w:val="BodyText"/>
+      </w:pPr>
+      <w:r>
+        <w:t xml:space="preserve">What is democratic input for? Forecasts should inform deliberation and never stand in for it; citizens must be able to examine the method, challenge the assumptions, and reject a forecast-based justification outright. How do disputes get resolved? Contested forecasts need appeals — a rival team rerunning the method, a public comment window, an independent review — not an oracle’s say-so.</w:t>
+      </w:r>
+    </w:p>
+    <w:p>
+      <w:pPr>
+        <w:pStyle w:val="BodyText"/>
+      </w:pPr>
+      <w:r>
+        <w:t xml:space="preserve">And the hardest one: what happens when the forecast and today’s expressed values disagree? The honest answer stays uncertain, and the 2024 reversal is the standing cautionary tale, because a 2020 projection of continued acceptance, used to justify anything at all, would have been overconfident within four years. Whatever governs this work has to be built to absorb surprise and revise — built like the scoreboard, not like a prophet.</w:t>
       </w:r>
     </w:p>
     <w:bookmarkEnd w:id="153"/>
@@ -8681,7 +8685,7 @@
         <w:pStyle w:val="BodyText"/>
       </w:pPr>
       <w:r>
-        <w:t xml:space="preserve">The five entries are one structure pulled apart along its natural seams — three of the introduction’s four questions, given institutional homes with different verification loops; the fourth stays where the introduction left it, with the public. PolicyEngine keeps its name and its users; underneath, it is being recomposed into Axiom, which holds what the law says, and populace, which holds who the people are, with Thesis as the third pole for what will happen: the decomposition chapter 12 argued for, built in organizational form.</w:t>
+        <w:t xml:space="preserve">The five entries are one structure pulled apart along its natural seams — three of the introduction’s four questions, given institutional homes with different verification loops; the fourth stays where the introduction left it, with the public. PolicyEngine keeps its name and its users; underneath, it is being recomposed into Axiom, which holds what the law says, and populace, which holds who the people are, with Thesis as the third pole for what will happen: the decomposition chapter 12 argued for, with repositories and launch dates where the argument used to be.</w:t>
       </w:r>
     </w:p>
     <w:p>
@@ -8791,7 +8795,7 @@
         <w:pStyle w:val="BodyText"/>
       </w:pPr>
       <w:r>
-        <w:t xml:space="preserve">The prediction pole has no track record. The Thesis Institute has not resolved a single forecast. Its scoreboard is a set of promises with intervals attached, not a record of hits, and until reality grades them they are predictions, not evidence. Saying this out loud, repeatedly, is the entire reason to build a scoreboard instead of a megaphone.</w:t>
+        <w:t xml:space="preserve">The prediction pole has no track record. The Thesis Institute has not resolved a single forecast. Its scoreboard is a set of promises with intervals attached; until reality grades them, they are predictions, not evidence. Saying this out loud, repeatedly, is the entire reason to build a scoreboard instead of a megaphone.</w:t>
       </w:r>
     </w:p>
     <w:p>
@@ -8964,7 +8968,7 @@
         <w:pStyle w:val="BodyText"/>
       </w:pPr>
       <w:r>
-        <w:t xml:space="preserve">So the invitation is quiet, because the work does not need believers; it needs checkers. The code is public. The encodings can be read, the models run against your own questions, the forecast docket watched while it earns or fails to earn a record. Find something wrong and file it; the findings ledgers already run in both directions — divergences dispositioned against our encodings, bugs filed upstream against the reference models themselves. Or reject the premise entirely: argue that these tools entrench technocracy rather than open analysis, that what is measurable will crowd out what matters. I think that argument is wrong, and I would rather lose it in the open, against specifics anyone can examine, than win it by default behind glass.</w:t>
+        <w:t xml:space="preserve">So the invitation is quiet, because the work does not need believers; it needs checkers. The code is public. The encodings can be read, the models run against your own questions, the forecast docket watched while it earns or fails to earn a record — the admission rule chapter 3 stated and every chapter since has enforced, now in your hands. Find something wrong and file it; the findings ledgers already run in both directions — divergences dispositioned against our encodings, bugs filed upstream against the reference models themselves. Or reject the premise entirely: argue that these tools entrench technocracy rather than open analysis, that what is measurable will crowd out what matters. I think that argument is wrong, and I would rather lose it in the open, against specifics anyone can examine, than win it by default behind glass.</w:t>
       </w:r>
     </w:p>
     <w:p>

</xml_diff>